<commit_message>
day 26 home tasks
</commit_message>
<xml_diff>
--- a/DaywiseDocs/10096255_Day26.docx
+++ b/DaywiseDocs/10096255_Day26.docx
@@ -7255,6 +7255,2458 @@
       </w:pPr>
       <w:r>
         <w:t>This creates services that are separated according to business responsibilities, rather than simply splitting the code into random pieces.</w:t>
+      </w:r>
+    </w:p>
+    <w:p/>
+    <w:p>
+      <w:pPr>
+        <w:rPr>
+          <w:b/>
+          <w:bCs/>
+        </w:rPr>
+      </w:pPr>
+      <w:r>
+        <w:rPr>
+          <w:b/>
+          <w:bCs/>
+        </w:rPr>
+        <w:t>Task 20 — Modernization and Migration Patterns</w:t>
+      </w:r>
+    </w:p>
+    <w:p>
+      <w:pPr>
+        <w:rPr>
+          <w:b/>
+          <w:bCs/>
+        </w:rPr>
+      </w:pPr>
+      <w:r>
+        <w:rPr>
+          <w:rFonts w:ascii="Segoe UI Emoji" w:hAnsi="Segoe UI Emoji" w:cs="Segoe UI Emoji"/>
+          <w:b/>
+          <w:bCs/>
+        </w:rPr>
+        <w:t>🌱</w:t>
+      </w:r>
+      <w:r>
+        <w:rPr>
+          <w:b/>
+          <w:bCs/>
+        </w:rPr>
+        <w:t xml:space="preserve"> Strangler Fig Pattern in Practice</w:t>
+      </w:r>
+    </w:p>
+    <w:p>
+      <w:pPr>
+        <w:rPr>
+          <w:b/>
+          <w:bCs/>
+        </w:rPr>
+      </w:pPr>
+      <w:r>
+        <w:rPr>
+          <w:b/>
+          <w:bCs/>
+        </w:rPr>
+        <w:t>Conceptual Question</w:t>
+      </w:r>
+    </w:p>
+    <w:p>
+      <w:r>
+        <w:rPr>
+          <w:b/>
+          <w:bCs/>
+        </w:rPr>
+        <w:t>How does the Strangler Fig Pattern reduce risk compared to a “big bang” rewrite of a monolithic system?</w:t>
+      </w:r>
+    </w:p>
+    <w:p>
+      <w:pPr>
+        <w:rPr>
+          <w:b/>
+          <w:bCs/>
+        </w:rPr>
+      </w:pPr>
+      <w:r>
+        <w:rPr>
+          <w:b/>
+          <w:bCs/>
+        </w:rPr>
+        <w:t>Answer</w:t>
+      </w:r>
+    </w:p>
+    <w:p>
+      <w:r>
+        <w:t xml:space="preserve">The </w:t>
+      </w:r>
+      <w:r>
+        <w:rPr>
+          <w:b/>
+          <w:bCs/>
+        </w:rPr>
+        <w:t>Strangler Fig Pattern</w:t>
+      </w:r>
+      <w:r>
+        <w:t xml:space="preserve"> is a method of replacing a monolithic application </w:t>
+      </w:r>
+      <w:r>
+        <w:rPr>
+          <w:b/>
+          <w:bCs/>
+        </w:rPr>
+        <w:t>step by step</w:t>
+      </w:r>
+      <w:r>
+        <w:t xml:space="preserve"> instead of rewriting the entire application at once.</w:t>
+      </w:r>
+    </w:p>
+    <w:p>
+      <w:r>
+        <w:rPr>
+          <w:b/>
+          <w:bCs/>
+        </w:rPr>
+        <w:t>Important points:</w:t>
+      </w:r>
+    </w:p>
+    <w:p>
+      <w:pPr>
+        <w:numPr>
+          <w:ilvl w:val="0"/>
+          <w:numId w:val="11"/>
+        </w:numPr>
+      </w:pPr>
+      <w:r>
+        <w:t xml:space="preserve">In a big-bang rewrite, the entire old application is replaced at one time. This can be risky and difficult to test. </w:t>
+      </w:r>
+    </w:p>
+    <w:p>
+      <w:pPr>
+        <w:numPr>
+          <w:ilvl w:val="0"/>
+          <w:numId w:val="11"/>
+        </w:numPr>
+      </w:pPr>
+      <w:r>
+        <w:t xml:space="preserve">In the Strangler Fig Pattern, </w:t>
+      </w:r>
+      <w:r>
+        <w:rPr>
+          <w:b/>
+          <w:bCs/>
+        </w:rPr>
+        <w:t>small parts of the old application are replaced one at a time</w:t>
+      </w:r>
+      <w:r>
+        <w:t xml:space="preserve">. </w:t>
+      </w:r>
+    </w:p>
+    <w:p>
+      <w:pPr>
+        <w:numPr>
+          <w:ilvl w:val="0"/>
+          <w:numId w:val="11"/>
+        </w:numPr>
+      </w:pPr>
+      <w:r>
+        <w:t xml:space="preserve">New functionality is developed using modern technologies such as microservices. </w:t>
+      </w:r>
+    </w:p>
+    <w:p>
+      <w:pPr>
+        <w:numPr>
+          <w:ilvl w:val="0"/>
+          <w:numId w:val="11"/>
+        </w:numPr>
+      </w:pPr>
+      <w:r>
+        <w:t xml:space="preserve">The old system continues to handle the parts that have not yet been migrated. </w:t>
+      </w:r>
+    </w:p>
+    <w:p>
+      <w:pPr>
+        <w:numPr>
+          <w:ilvl w:val="0"/>
+          <w:numId w:val="11"/>
+        </w:numPr>
+      </w:pPr>
+      <w:r>
+        <w:t xml:space="preserve">A gateway or routing layer can decide whether a request goes to the </w:t>
+      </w:r>
+      <w:r>
+        <w:rPr>
+          <w:b/>
+          <w:bCs/>
+        </w:rPr>
+        <w:t>old system or the new service</w:t>
+      </w:r>
+      <w:r>
+        <w:t xml:space="preserve">. </w:t>
+      </w:r>
+    </w:p>
+    <w:p>
+      <w:pPr>
+        <w:numPr>
+          <w:ilvl w:val="0"/>
+          <w:numId w:val="11"/>
+        </w:numPr>
+      </w:pPr>
+      <w:r>
+        <w:t xml:space="preserve">Each migrated part can be tested independently. </w:t>
+      </w:r>
+    </w:p>
+    <w:p>
+      <w:pPr>
+        <w:numPr>
+          <w:ilvl w:val="0"/>
+          <w:numId w:val="11"/>
+        </w:numPr>
+      </w:pPr>
+      <w:r>
+        <w:t xml:space="preserve">If a problem occurs, the affected part can be fixed or moved back to the old system. </w:t>
+      </w:r>
+    </w:p>
+    <w:p>
+      <w:pPr>
+        <w:numPr>
+          <w:ilvl w:val="0"/>
+          <w:numId w:val="11"/>
+        </w:numPr>
+      </w:pPr>
+      <w:r>
+        <w:t xml:space="preserve">It reduces </w:t>
+      </w:r>
+      <w:r>
+        <w:rPr>
+          <w:b/>
+          <w:bCs/>
+        </w:rPr>
+        <w:t>downtime, development risk, and business impact</w:t>
+      </w:r>
+      <w:r>
+        <w:t xml:space="preserve">. </w:t>
+      </w:r>
+    </w:p>
+    <w:p>
+      <w:pPr>
+        <w:numPr>
+          <w:ilvl w:val="0"/>
+          <w:numId w:val="11"/>
+        </w:numPr>
+      </w:pPr>
+      <w:r>
+        <w:t xml:space="preserve">Once all important functionality has been migrated, the old monolith can be removed. </w:t>
+      </w:r>
+    </w:p>
+    <w:p>
+      <w:r>
+        <w:rPr>
+          <w:b/>
+          <w:bCs/>
+        </w:rPr>
+        <w:t>Simple example:</w:t>
+      </w:r>
+      <w:r>
+        <w:br/>
+        <w:t xml:space="preserve">If a monolithic application has </w:t>
+      </w:r>
+      <w:r>
+        <w:rPr>
+          <w:b/>
+          <w:bCs/>
+        </w:rPr>
+        <w:t>Orders, Payments, and Inventory</w:t>
+      </w:r>
+      <w:r>
+        <w:t>, we can first move Orders to a new microservice. Payments and Inventory can continue running in the old application. Later, we can migrate the remaining modules.</w:t>
+      </w:r>
+    </w:p>
+    <w:p>
+      <w:r>
+        <w:pict w14:anchorId="3B1DC7C4">
+          <v:rect id="_x0000_i1061" style="width:0;height:1.5pt" o:hralign="center" o:hrstd="t" o:hr="t" fillcolor="#a0a0a0" stroked="f"/>
+        </w:pict>
+      </w:r>
+    </w:p>
+    <w:p>
+      <w:pPr>
+        <w:rPr>
+          <w:b/>
+          <w:bCs/>
+        </w:rPr>
+      </w:pPr>
+      <w:r>
+        <w:rPr>
+          <w:rFonts w:ascii="Segoe UI Emoji" w:hAnsi="Segoe UI Emoji" w:cs="Segoe UI Emoji"/>
+          <w:b/>
+          <w:bCs/>
+        </w:rPr>
+        <w:t>🛡️</w:t>
+      </w:r>
+      <w:r>
+        <w:rPr>
+          <w:b/>
+          <w:bCs/>
+        </w:rPr>
+        <w:t xml:space="preserve"> Anti-Corruption Layer Implementation</w:t>
+      </w:r>
+    </w:p>
+    <w:p>
+      <w:pPr>
+        <w:rPr>
+          <w:b/>
+          <w:bCs/>
+        </w:rPr>
+      </w:pPr>
+      <w:r>
+        <w:rPr>
+          <w:b/>
+          <w:bCs/>
+        </w:rPr>
+        <w:lastRenderedPageBreak/>
+        <w:t>Conceptual Question</w:t>
+      </w:r>
+    </w:p>
+    <w:p>
+      <w:r>
+        <w:rPr>
+          <w:b/>
+          <w:bCs/>
+        </w:rPr>
+        <w:t>Why is an Anti-Corruption Layer critical when integrating a modern microservice with a legacy system?</w:t>
+      </w:r>
+    </w:p>
+    <w:p>
+      <w:pPr>
+        <w:rPr>
+          <w:b/>
+          <w:bCs/>
+        </w:rPr>
+      </w:pPr>
+      <w:r>
+        <w:rPr>
+          <w:b/>
+          <w:bCs/>
+        </w:rPr>
+        <w:t>Answer</w:t>
+      </w:r>
+    </w:p>
+    <w:p>
+      <w:r>
+        <w:t xml:space="preserve">An </w:t>
+      </w:r>
+      <w:r>
+        <w:rPr>
+          <w:b/>
+          <w:bCs/>
+        </w:rPr>
+        <w:t>Anti-Corruption Layer (ACL)</w:t>
+      </w:r>
+      <w:r>
+        <w:t xml:space="preserve"> is a layer between a new system and a legacy system. Its main purpose is to </w:t>
+      </w:r>
+      <w:r>
+        <w:rPr>
+          <w:b/>
+          <w:bCs/>
+        </w:rPr>
+        <w:t>protect the new system from the old system's design and data formats</w:t>
+      </w:r>
+      <w:r>
+        <w:t>.</w:t>
+      </w:r>
+    </w:p>
+    <w:p>
+      <w:r>
+        <w:rPr>
+          <w:b/>
+          <w:bCs/>
+        </w:rPr>
+        <w:t>Important points:</w:t>
+      </w:r>
+    </w:p>
+    <w:p>
+      <w:pPr>
+        <w:numPr>
+          <w:ilvl w:val="0"/>
+          <w:numId w:val="12"/>
+        </w:numPr>
+      </w:pPr>
+      <w:r>
+        <w:t xml:space="preserve">Legacy systems may use old technologies, data formats, or business rules. </w:t>
+      </w:r>
+    </w:p>
+    <w:p>
+      <w:pPr>
+        <w:numPr>
+          <w:ilvl w:val="0"/>
+          <w:numId w:val="12"/>
+        </w:numPr>
+      </w:pPr>
+      <w:r>
+        <w:t xml:space="preserve">A modern microservice may use completely different technologies and data structures. </w:t>
+      </w:r>
+    </w:p>
+    <w:p>
+      <w:pPr>
+        <w:numPr>
+          <w:ilvl w:val="0"/>
+          <w:numId w:val="12"/>
+        </w:numPr>
+      </w:pPr>
+      <w:r>
+        <w:t xml:space="preserve">Directly connecting the two systems can make the new system dependent on the legacy system. </w:t>
+      </w:r>
+    </w:p>
+    <w:p>
+      <w:pPr>
+        <w:numPr>
+          <w:ilvl w:val="0"/>
+          <w:numId w:val="12"/>
+        </w:numPr>
+      </w:pPr>
+      <w:r>
+        <w:t xml:space="preserve">The Anti-Corruption Layer works as a </w:t>
+      </w:r>
+      <w:r>
+        <w:rPr>
+          <w:b/>
+          <w:bCs/>
+        </w:rPr>
+        <w:t>translator or adapter</w:t>
+      </w:r>
+      <w:r>
+        <w:t xml:space="preserve"> between them. </w:t>
+      </w:r>
+    </w:p>
+    <w:p>
+      <w:pPr>
+        <w:numPr>
+          <w:ilvl w:val="0"/>
+          <w:numId w:val="12"/>
+        </w:numPr>
+      </w:pPr>
+      <w:r>
+        <w:t xml:space="preserve">It converts legacy data into a format that the new microservice understands. </w:t>
+      </w:r>
+    </w:p>
+    <w:p>
+      <w:pPr>
+        <w:numPr>
+          <w:ilvl w:val="0"/>
+          <w:numId w:val="12"/>
+        </w:numPr>
+      </w:pPr>
+      <w:r>
+        <w:t xml:space="preserve">It also converts requests from the new system into a format understood by the legacy system. </w:t>
+      </w:r>
+    </w:p>
+    <w:p>
+      <w:pPr>
+        <w:numPr>
+          <w:ilvl w:val="0"/>
+          <w:numId w:val="12"/>
+        </w:numPr>
+      </w:pPr>
+      <w:r>
+        <w:t xml:space="preserve">It keeps legacy-specific code outside the new microservice. </w:t>
+      </w:r>
+    </w:p>
+    <w:p>
+      <w:pPr>
+        <w:numPr>
+          <w:ilvl w:val="0"/>
+          <w:numId w:val="12"/>
+        </w:numPr>
+      </w:pPr>
+      <w:r>
+        <w:t xml:space="preserve">This reduces </w:t>
+      </w:r>
+      <w:r>
+        <w:rPr>
+          <w:b/>
+          <w:bCs/>
+        </w:rPr>
+        <w:t>tight coupling</w:t>
+      </w:r>
+      <w:r>
+        <w:t xml:space="preserve"> between old and new systems. </w:t>
+      </w:r>
+    </w:p>
+    <w:p>
+      <w:pPr>
+        <w:numPr>
+          <w:ilvl w:val="0"/>
+          <w:numId w:val="12"/>
+        </w:numPr>
+      </w:pPr>
+      <w:r>
+        <w:t xml:space="preserve">It makes the new microservice easier to develop, test, and maintain. </w:t>
+      </w:r>
+    </w:p>
+    <w:p>
+      <w:pPr>
+        <w:numPr>
+          <w:ilvl w:val="0"/>
+          <w:numId w:val="12"/>
+        </w:numPr>
+      </w:pPr>
+      <w:r>
+        <w:t xml:space="preserve">When the legacy system is eventually removed, the ACL can also be removed. </w:t>
+      </w:r>
+    </w:p>
+    <w:p>
+      <w:r>
+        <w:rPr>
+          <w:b/>
+          <w:bCs/>
+        </w:rPr>
+        <w:t>Simple example:</w:t>
+      </w:r>
+      <w:r>
+        <w:br/>
+        <w:t xml:space="preserve">A legacy system may return customer information in </w:t>
+      </w:r>
+      <w:r>
+        <w:rPr>
+          <w:b/>
+          <w:bCs/>
+        </w:rPr>
+        <w:t>XML</w:t>
+      </w:r>
+      <w:r>
+        <w:t xml:space="preserve">, while the new microservice uses </w:t>
+      </w:r>
+      <w:r>
+        <w:rPr>
+          <w:b/>
+          <w:bCs/>
+        </w:rPr>
+        <w:t>JSON</w:t>
+      </w:r>
+      <w:r>
+        <w:t>. The Anti-Corruption Layer can convert the XML response into a JSON-based DTO.</w:t>
+      </w:r>
+    </w:p>
+    <w:p>
+      <w:r>
+        <w:pict w14:anchorId="00856ACC">
+          <v:rect id="_x0000_i1062" style="width:0;height:1.5pt" o:hralign="center" o:hrstd="t" o:hr="t" fillcolor="#a0a0a0" stroked="f"/>
+        </w:pict>
+      </w:r>
+    </w:p>
+    <w:p>
+      <w:pPr>
+        <w:rPr>
+          <w:b/>
+          <w:bCs/>
+        </w:rPr>
+      </w:pPr>
+      <w:r>
+        <w:rPr>
+          <w:rFonts w:ascii="Segoe UI Emoji" w:hAnsi="Segoe UI Emoji" w:cs="Segoe UI Emoji"/>
+          <w:b/>
+          <w:bCs/>
+        </w:rPr>
+        <w:t>🌳</w:t>
+      </w:r>
+      <w:r>
+        <w:rPr>
+          <w:b/>
+          <w:bCs/>
+        </w:rPr>
+        <w:t xml:space="preserve"> Branch by Abstraction</w:t>
+      </w:r>
+    </w:p>
+    <w:p>
+      <w:pPr>
+        <w:rPr>
+          <w:b/>
+          <w:bCs/>
+        </w:rPr>
+      </w:pPr>
+      <w:r>
+        <w:rPr>
+          <w:b/>
+          <w:bCs/>
+        </w:rPr>
+        <w:t>Conceptual Question</w:t>
+      </w:r>
+    </w:p>
+    <w:p>
+      <w:r>
+        <w:rPr>
+          <w:b/>
+          <w:bCs/>
+        </w:rPr>
+        <w:t>What advantages does Branch by Abstraction provide over traditional branching strategies during refactoring?</w:t>
+      </w:r>
+    </w:p>
+    <w:p>
+      <w:pPr>
+        <w:rPr>
+          <w:b/>
+          <w:bCs/>
+        </w:rPr>
+      </w:pPr>
+      <w:r>
+        <w:rPr>
+          <w:b/>
+          <w:bCs/>
+        </w:rPr>
+        <w:t>Answer</w:t>
+      </w:r>
+    </w:p>
+    <w:p>
+      <w:r>
+        <w:rPr>
+          <w:b/>
+          <w:bCs/>
+        </w:rPr>
+        <w:t>Branch by Abstraction</w:t>
+      </w:r>
+      <w:r>
+        <w:t xml:space="preserve"> is a technique used to safely replace an existing implementation with a new one while keeping the application running.</w:t>
+      </w:r>
+    </w:p>
+    <w:p>
+      <w:r>
+        <w:rPr>
+          <w:b/>
+          <w:bCs/>
+        </w:rPr>
+        <w:t>Important points:</w:t>
+      </w:r>
+    </w:p>
+    <w:p>
+      <w:pPr>
+        <w:numPr>
+          <w:ilvl w:val="0"/>
+          <w:numId w:val="13"/>
+        </w:numPr>
+      </w:pPr>
+      <w:r>
+        <w:t xml:space="preserve">First, developers create an </w:t>
+      </w:r>
+      <w:r>
+        <w:rPr>
+          <w:b/>
+          <w:bCs/>
+        </w:rPr>
+        <w:t>abstraction or interface</w:t>
+      </w:r>
+      <w:r>
+        <w:t xml:space="preserve"> around the existing functionality. </w:t>
+      </w:r>
+    </w:p>
+    <w:p>
+      <w:pPr>
+        <w:numPr>
+          <w:ilvl w:val="0"/>
+          <w:numId w:val="13"/>
+        </w:numPr>
+      </w:pPr>
+      <w:r>
+        <w:t xml:space="preserve">The existing implementation continues to work through this abstraction. </w:t>
+      </w:r>
+    </w:p>
+    <w:p>
+      <w:pPr>
+        <w:numPr>
+          <w:ilvl w:val="0"/>
+          <w:numId w:val="13"/>
+        </w:numPr>
+      </w:pPr>
+      <w:r>
+        <w:lastRenderedPageBreak/>
+        <w:t xml:space="preserve">A new implementation is then developed using the same abstraction. </w:t>
+      </w:r>
+    </w:p>
+    <w:p>
+      <w:pPr>
+        <w:numPr>
+          <w:ilvl w:val="0"/>
+          <w:numId w:val="13"/>
+        </w:numPr>
+      </w:pPr>
+      <w:r>
+        <w:t xml:space="preserve">Both old and new implementations can exist at the same time. </w:t>
+      </w:r>
+    </w:p>
+    <w:p>
+      <w:pPr>
+        <w:numPr>
+          <w:ilvl w:val="0"/>
+          <w:numId w:val="13"/>
+        </w:numPr>
+      </w:pPr>
+      <w:r>
+        <w:t xml:space="preserve">The application can switch between the old and new implementations. </w:t>
+      </w:r>
+    </w:p>
+    <w:p>
+      <w:pPr>
+        <w:numPr>
+          <w:ilvl w:val="0"/>
+          <w:numId w:val="13"/>
+        </w:numPr>
+      </w:pPr>
+      <w:r>
+        <w:t xml:space="preserve">Developers can test the new implementation without immediately removing the old one. </w:t>
+      </w:r>
+    </w:p>
+    <w:p>
+      <w:pPr>
+        <w:numPr>
+          <w:ilvl w:val="0"/>
+          <w:numId w:val="13"/>
+        </w:numPr>
+      </w:pPr>
+      <w:r>
+        <w:t xml:space="preserve">If the new implementation has problems, the application can switch back to the old implementation. </w:t>
+      </w:r>
+    </w:p>
+    <w:p>
+      <w:pPr>
+        <w:numPr>
+          <w:ilvl w:val="0"/>
+          <w:numId w:val="13"/>
+        </w:numPr>
+      </w:pPr>
+      <w:r>
+        <w:t xml:space="preserve">It reduces the risk of large refactoring changes. </w:t>
+      </w:r>
+    </w:p>
+    <w:p>
+      <w:pPr>
+        <w:numPr>
+          <w:ilvl w:val="0"/>
+          <w:numId w:val="13"/>
+        </w:numPr>
+      </w:pPr>
+      <w:r>
+        <w:t xml:space="preserve">It avoids keeping a long-lived separate branch for the entire refactoring. </w:t>
+      </w:r>
+    </w:p>
+    <w:p>
+      <w:pPr>
+        <w:numPr>
+          <w:ilvl w:val="0"/>
+          <w:numId w:val="13"/>
+        </w:numPr>
+      </w:pPr>
+      <w:r>
+        <w:t xml:space="preserve">Once the new implementation is stable, the old implementation can be removed. </w:t>
+      </w:r>
+    </w:p>
+    <w:p>
+      <w:r>
+        <w:rPr>
+          <w:b/>
+          <w:bCs/>
+        </w:rPr>
+        <w:t>Simple example:</w:t>
+      </w:r>
+      <w:r>
+        <w:br/>
+        <w:t xml:space="preserve">Suppose an application has an old payment system. We create a </w:t>
+      </w:r>
+      <w:proofErr w:type="spellStart"/>
+      <w:r>
+        <w:t>PaymentProcessor</w:t>
+      </w:r>
+      <w:proofErr w:type="spellEnd"/>
+      <w:r>
+        <w:t xml:space="preserve"> interface. Both the </w:t>
+      </w:r>
+      <w:r>
+        <w:rPr>
+          <w:b/>
+          <w:bCs/>
+        </w:rPr>
+        <w:t>old payment processor</w:t>
+      </w:r>
+      <w:r>
+        <w:t xml:space="preserve"> and </w:t>
+      </w:r>
+      <w:r>
+        <w:rPr>
+          <w:b/>
+          <w:bCs/>
+        </w:rPr>
+        <w:t>new payment processor</w:t>
+      </w:r>
+      <w:r>
+        <w:t xml:space="preserve"> implement it. The application can use either one while the migration is taking place.</w:t>
+      </w:r>
+    </w:p>
+    <w:p>
+      <w:r>
+        <w:pict w14:anchorId="195EB741">
+          <v:rect id="_x0000_i1063" style="width:0;height:1.5pt" o:hralign="center" o:hrstd="t" o:hr="t" fillcolor="#a0a0a0" stroked="f"/>
+        </w:pict>
+      </w:r>
+    </w:p>
+    <w:p>
+      <w:pPr>
+        <w:rPr>
+          <w:b/>
+          <w:bCs/>
+        </w:rPr>
+      </w:pPr>
+      <w:r>
+        <w:rPr>
+          <w:b/>
+          <w:bCs/>
+        </w:rPr>
+        <w:t xml:space="preserve"> Database Decomposition and Shared-Data Challenges</w:t>
+      </w:r>
+    </w:p>
+    <w:p>
+      <w:pPr>
+        <w:rPr>
+          <w:b/>
+          <w:bCs/>
+        </w:rPr>
+      </w:pPr>
+      <w:r>
+        <w:rPr>
+          <w:b/>
+          <w:bCs/>
+        </w:rPr>
+        <w:t>Question</w:t>
+      </w:r>
+    </w:p>
+    <w:p>
+      <w:r>
+        <w:rPr>
+          <w:b/>
+          <w:bCs/>
+        </w:rPr>
+        <w:t>What are the risks of shared databases across multiple microservices, and how can decomposition mitigate them?</w:t>
+      </w:r>
+    </w:p>
+    <w:p>
+      <w:pPr>
+        <w:rPr>
+          <w:b/>
+          <w:bCs/>
+        </w:rPr>
+      </w:pPr>
+      <w:r>
+        <w:rPr>
+          <w:b/>
+          <w:bCs/>
+        </w:rPr>
+        <w:t>Answer</w:t>
+      </w:r>
+    </w:p>
+    <w:p>
+      <w:r>
+        <w:t xml:space="preserve">A shared database means multiple microservices directly use the </w:t>
+      </w:r>
+      <w:r>
+        <w:rPr>
+          <w:b/>
+          <w:bCs/>
+        </w:rPr>
+        <w:t>same database or tables</w:t>
+      </w:r>
+      <w:r>
+        <w:t>. This can create strong dependencies between services.</w:t>
+      </w:r>
+    </w:p>
+    <w:p>
+      <w:r>
+        <w:rPr>
+          <w:b/>
+          <w:bCs/>
+        </w:rPr>
+        <w:t>Important points:</w:t>
+      </w:r>
+    </w:p>
+    <w:p>
+      <w:pPr>
+        <w:numPr>
+          <w:ilvl w:val="0"/>
+          <w:numId w:val="14"/>
+        </w:numPr>
+      </w:pPr>
+      <w:r>
+        <w:t xml:space="preserve">Multiple services become dependent on the same database structure. </w:t>
+      </w:r>
+    </w:p>
+    <w:p>
+      <w:pPr>
+        <w:numPr>
+          <w:ilvl w:val="0"/>
+          <w:numId w:val="14"/>
+        </w:numPr>
+      </w:pPr>
+      <w:r>
+        <w:t xml:space="preserve">A change to one table can break several services. </w:t>
+      </w:r>
+    </w:p>
+    <w:p>
+      <w:pPr>
+        <w:numPr>
+          <w:ilvl w:val="0"/>
+          <w:numId w:val="14"/>
+        </w:numPr>
+      </w:pPr>
+      <w:r>
+        <w:t xml:space="preserve">It becomes difficult to identify which service owns the data. </w:t>
+      </w:r>
+    </w:p>
+    <w:p>
+      <w:pPr>
+        <w:numPr>
+          <w:ilvl w:val="0"/>
+          <w:numId w:val="14"/>
+        </w:numPr>
+      </w:pPr>
+      <w:r>
+        <w:t xml:space="preserve">Services become </w:t>
+      </w:r>
+      <w:r>
+        <w:rPr>
+          <w:b/>
+          <w:bCs/>
+        </w:rPr>
+        <w:t>tightly coupled</w:t>
+      </w:r>
+      <w:r>
+        <w:t xml:space="preserve">. </w:t>
+      </w:r>
+    </w:p>
+    <w:p>
+      <w:pPr>
+        <w:numPr>
+          <w:ilvl w:val="0"/>
+          <w:numId w:val="14"/>
+        </w:numPr>
+      </w:pPr>
+      <w:r>
+        <w:t xml:space="preserve">Database performance problems can affect multiple services. </w:t>
+      </w:r>
+    </w:p>
+    <w:p>
+      <w:pPr>
+        <w:numPr>
+          <w:ilvl w:val="0"/>
+          <w:numId w:val="14"/>
+        </w:numPr>
+      </w:pPr>
+      <w:r>
+        <w:t xml:space="preserve">Independent deployment becomes more difficult. </w:t>
+      </w:r>
+    </w:p>
+    <w:p>
+      <w:pPr>
+        <w:numPr>
+          <w:ilvl w:val="0"/>
+          <w:numId w:val="14"/>
+        </w:numPr>
+      </w:pPr>
+      <w:r>
+        <w:t xml:space="preserve">Different services may need different database technologies or structures. </w:t>
+      </w:r>
+    </w:p>
+    <w:p>
+      <w:pPr>
+        <w:numPr>
+          <w:ilvl w:val="0"/>
+          <w:numId w:val="14"/>
+        </w:numPr>
+      </w:pPr>
+      <w:r>
+        <w:t xml:space="preserve">Database decomposition separates data according to </w:t>
+      </w:r>
+      <w:r>
+        <w:rPr>
+          <w:b/>
+          <w:bCs/>
+        </w:rPr>
+        <w:t>service ownership</w:t>
+      </w:r>
+      <w:r>
+        <w:t xml:space="preserve">. </w:t>
+      </w:r>
+    </w:p>
+    <w:p>
+      <w:pPr>
+        <w:numPr>
+          <w:ilvl w:val="0"/>
+          <w:numId w:val="14"/>
+        </w:numPr>
+      </w:pPr>
+      <w:r>
+        <w:t xml:space="preserve">Each microservice can own and manage its own database or data. </w:t>
+      </w:r>
+    </w:p>
+    <w:p>
+      <w:pPr>
+        <w:numPr>
+          <w:ilvl w:val="0"/>
+          <w:numId w:val="14"/>
+        </w:numPr>
+      </w:pPr>
+      <w:r>
+        <w:lastRenderedPageBreak/>
+        <w:t xml:space="preserve">Services communicate through APIs or messaging instead of directly accessing another service's tables. </w:t>
+      </w:r>
+    </w:p>
+    <w:p>
+      <w:pPr>
+        <w:numPr>
+          <w:ilvl w:val="0"/>
+          <w:numId w:val="14"/>
+        </w:numPr>
+      </w:pPr>
+      <w:r>
+        <w:t xml:space="preserve">This improves </w:t>
+      </w:r>
+      <w:r>
+        <w:rPr>
+          <w:b/>
+          <w:bCs/>
+        </w:rPr>
+        <w:t>independence, scalability, and maintainability</w:t>
+      </w:r>
+      <w:r>
+        <w:t xml:space="preserve">. </w:t>
+      </w:r>
+    </w:p>
+    <w:p>
+      <w:r>
+        <w:rPr>
+          <w:b/>
+          <w:bCs/>
+        </w:rPr>
+        <w:t>Simple example:</w:t>
+      </w:r>
+    </w:p>
+    <w:p>
+      <w:r>
+        <w:t>Instead of:</w:t>
+      </w:r>
+    </w:p>
+    <w:p>
+      <w:r>
+        <w:t>Order Service ──┐</w:t>
+      </w:r>
+    </w:p>
+    <w:p>
+      <w:r>
+        <w:t xml:space="preserve">Payment Service </w:t>
+      </w:r>
+      <w:r>
+        <w:rPr>
+          <w:rFonts w:ascii="MS Gothic" w:eastAsia="MS Gothic" w:hAnsi="MS Gothic" w:cs="MS Gothic" w:hint="eastAsia"/>
+        </w:rPr>
+        <w:t>├</w:t>
+      </w:r>
+      <w:r>
+        <w:rPr>
+          <w:rFonts w:ascii="Calibri" w:hAnsi="Calibri" w:cs="Calibri"/>
+        </w:rPr>
+        <w:t>──</w:t>
+      </w:r>
+      <w:r>
+        <w:t>&gt; Shared Database</w:t>
+      </w:r>
+    </w:p>
+    <w:p>
+      <w:r>
+        <w:t>User Service ───┘</w:t>
+      </w:r>
+    </w:p>
+    <w:p>
+      <w:r>
+        <w:t>we can have:</w:t>
+      </w:r>
+    </w:p>
+    <w:p>
+      <w:r>
+        <w:t>Order Service   → Order Database</w:t>
+      </w:r>
+    </w:p>
+    <w:p>
+      <w:r>
+        <w:t>Payment Service → Payment Database</w:t>
+      </w:r>
+    </w:p>
+    <w:p>
+      <w:r>
+        <w:t>User Service    → User Database</w:t>
+      </w:r>
+    </w:p>
+    <w:p>
+      <w:r>
+        <w:t>This gives each service clearer responsibility for its own data.</w:t>
+      </w:r>
+    </w:p>
+    <w:p>
+      <w:r>
+        <w:pict w14:anchorId="61A8F35B">
+          <v:rect id="_x0000_i1064" style="width:0;height:1.5pt" o:hralign="center" o:hrstd="t" o:hr="t" fillcolor="#a0a0a0" stroked="f"/>
+        </w:pict>
+      </w:r>
+    </w:p>
+    <w:p>
+      <w:pPr>
+        <w:rPr>
+          <w:b/>
+          <w:bCs/>
+        </w:rPr>
+      </w:pPr>
+      <w:r>
+        <w:rPr>
+          <w:b/>
+          <w:bCs/>
+        </w:rPr>
+        <w:t xml:space="preserve"> Incremental Migration Strategies</w:t>
+      </w:r>
+    </w:p>
+    <w:p>
+      <w:pPr>
+        <w:rPr>
+          <w:b/>
+          <w:bCs/>
+        </w:rPr>
+      </w:pPr>
+      <w:r>
+        <w:rPr>
+          <w:b/>
+          <w:bCs/>
+        </w:rPr>
+        <w:t>Question</w:t>
+      </w:r>
+    </w:p>
+    <w:p>
+      <w:r>
+        <w:rPr>
+          <w:b/>
+          <w:bCs/>
+        </w:rPr>
+        <w:t>How does incremental migration help balance delivery speed and system stability during modernization?</w:t>
+      </w:r>
+    </w:p>
+    <w:p>
+      <w:pPr>
+        <w:rPr>
+          <w:b/>
+          <w:bCs/>
+        </w:rPr>
+      </w:pPr>
+      <w:r>
+        <w:rPr>
+          <w:b/>
+          <w:bCs/>
+        </w:rPr>
+        <w:t>Answer</w:t>
+      </w:r>
+    </w:p>
+    <w:p>
+      <w:r>
+        <w:rPr>
+          <w:b/>
+          <w:bCs/>
+        </w:rPr>
+        <w:t>Incremental migration</w:t>
+      </w:r>
+      <w:r>
+        <w:t xml:space="preserve"> means moving an old system to a new architecture </w:t>
+      </w:r>
+      <w:r>
+        <w:rPr>
+          <w:b/>
+          <w:bCs/>
+        </w:rPr>
+        <w:t>in small and manageable steps</w:t>
+      </w:r>
+      <w:r>
+        <w:t>.</w:t>
+      </w:r>
+    </w:p>
+    <w:p>
+      <w:r>
+        <w:rPr>
+          <w:b/>
+          <w:bCs/>
+        </w:rPr>
+        <w:t>Important points:</w:t>
+      </w:r>
+    </w:p>
+    <w:p>
+      <w:pPr>
+        <w:numPr>
+          <w:ilvl w:val="0"/>
+          <w:numId w:val="15"/>
+        </w:numPr>
+      </w:pPr>
+      <w:r>
+        <w:t xml:space="preserve">The complete system is not changed at once. </w:t>
+      </w:r>
+    </w:p>
+    <w:p>
+      <w:pPr>
+        <w:numPr>
+          <w:ilvl w:val="0"/>
+          <w:numId w:val="15"/>
+        </w:numPr>
+      </w:pPr>
+      <w:r>
+        <w:t xml:space="preserve">Small modules or features are migrated one by one. </w:t>
+      </w:r>
+    </w:p>
+    <w:p>
+      <w:pPr>
+        <w:numPr>
+          <w:ilvl w:val="0"/>
+          <w:numId w:val="15"/>
+        </w:numPr>
+      </w:pPr>
+      <w:r>
+        <w:t xml:space="preserve">The existing system continues to work during the migration. </w:t>
+      </w:r>
+    </w:p>
+    <w:p>
+      <w:pPr>
+        <w:numPr>
+          <w:ilvl w:val="0"/>
+          <w:numId w:val="15"/>
+        </w:numPr>
+      </w:pPr>
+      <w:r>
+        <w:t xml:space="preserve">Each migrated part can be tested independently. </w:t>
+      </w:r>
+    </w:p>
+    <w:p>
+      <w:pPr>
+        <w:numPr>
+          <w:ilvl w:val="0"/>
+          <w:numId w:val="15"/>
+        </w:numPr>
+      </w:pPr>
+      <w:r>
+        <w:t xml:space="preserve">Developers can find problems early. </w:t>
+      </w:r>
+    </w:p>
+    <w:p>
+      <w:pPr>
+        <w:numPr>
+          <w:ilvl w:val="0"/>
+          <w:numId w:val="15"/>
+        </w:numPr>
+      </w:pPr>
+      <w:r>
+        <w:t xml:space="preserve">Users can continue using the application during the migration. </w:t>
+      </w:r>
+    </w:p>
+    <w:p>
+      <w:pPr>
+        <w:numPr>
+          <w:ilvl w:val="0"/>
+          <w:numId w:val="15"/>
+        </w:numPr>
+      </w:pPr>
+      <w:r>
+        <w:t xml:space="preserve">New features can be delivered while migration is happening. </w:t>
+      </w:r>
+    </w:p>
+    <w:p>
+      <w:pPr>
+        <w:numPr>
+          <w:ilvl w:val="0"/>
+          <w:numId w:val="15"/>
+        </w:numPr>
+      </w:pPr>
+      <w:r>
+        <w:t xml:space="preserve">It reduces the risk of major system failure. </w:t>
+      </w:r>
+    </w:p>
+    <w:p>
+      <w:pPr>
+        <w:numPr>
+          <w:ilvl w:val="0"/>
+          <w:numId w:val="15"/>
+        </w:numPr>
+      </w:pPr>
+      <w:r>
+        <w:lastRenderedPageBreak/>
+        <w:t xml:space="preserve">It makes the migration easier to monitor and control. </w:t>
+      </w:r>
+    </w:p>
+    <w:p>
+      <w:pPr>
+        <w:numPr>
+          <w:ilvl w:val="0"/>
+          <w:numId w:val="15"/>
+        </w:numPr>
+      </w:pPr>
+      <w:r>
+        <w:t xml:space="preserve">Teams can stop or change the migration plan if a problem occurs. </w:t>
+      </w:r>
+    </w:p>
+    <w:p>
+      <w:r>
+        <w:rPr>
+          <w:b/>
+          <w:bCs/>
+        </w:rPr>
+        <w:t>Simple example:</w:t>
+      </w:r>
+      <w:r>
+        <w:br/>
+        <w:t>A company has a monolithic banking application. Instead of migrating everything at once, it can migrate:</w:t>
+      </w:r>
+    </w:p>
+    <w:p>
+      <w:r>
+        <w:t>Step 1 → Customer Service</w:t>
+      </w:r>
+    </w:p>
+    <w:p>
+      <w:r>
+        <w:t>Step 2 → Account Service</w:t>
+      </w:r>
+    </w:p>
+    <w:p>
+      <w:r>
+        <w:t>Step 3 → Transaction Service</w:t>
+      </w:r>
+    </w:p>
+    <w:p>
+      <w:r>
+        <w:t>Step 4 → Payment Service</w:t>
+      </w:r>
+    </w:p>
+    <w:p>
+      <w:r>
+        <w:t>The old system continues handling the remaining functionality until everything is migrated.</w:t>
+      </w:r>
+    </w:p>
+    <w:p>
+      <w:r>
+        <w:pict w14:anchorId="298CDEFC">
+          <v:rect id="_x0000_i1065" style="width:0;height:1.5pt" o:hralign="center" o:hrstd="t" o:hr="t" fillcolor="#a0a0a0" stroked="f"/>
+        </w:pict>
+      </w:r>
+    </w:p>
+    <w:p>
+      <w:pPr>
+        <w:rPr>
+          <w:b/>
+          <w:bCs/>
+        </w:rPr>
+      </w:pPr>
+      <w:r>
+        <w:rPr>
+          <w:rFonts w:ascii="Segoe UI Emoji" w:hAnsi="Segoe UI Emoji" w:cs="Segoe UI Emoji"/>
+          <w:b/>
+          <w:bCs/>
+        </w:rPr>
+        <w:t>🎛️</w:t>
+      </w:r>
+      <w:r>
+        <w:rPr>
+          <w:b/>
+          <w:bCs/>
+        </w:rPr>
+        <w:t xml:space="preserve"> Feature Toggles for Safe Rollout</w:t>
+      </w:r>
+    </w:p>
+    <w:p>
+      <w:pPr>
+        <w:rPr>
+          <w:b/>
+          <w:bCs/>
+        </w:rPr>
+      </w:pPr>
+      <w:r>
+        <w:rPr>
+          <w:b/>
+          <w:bCs/>
+        </w:rPr>
+        <w:t>Conceptual Question</w:t>
+      </w:r>
+    </w:p>
+    <w:p>
+      <w:r>
+        <w:rPr>
+          <w:b/>
+          <w:bCs/>
+        </w:rPr>
+        <w:t>How do feature toggles enable controlled experimentation and rollback in production environments?</w:t>
+      </w:r>
+    </w:p>
+    <w:p>
+      <w:pPr>
+        <w:rPr>
+          <w:b/>
+          <w:bCs/>
+        </w:rPr>
+      </w:pPr>
+      <w:r>
+        <w:rPr>
+          <w:b/>
+          <w:bCs/>
+        </w:rPr>
+        <w:t>Answer</w:t>
+      </w:r>
+    </w:p>
+    <w:p>
+      <w:r>
+        <w:t xml:space="preserve">A </w:t>
+      </w:r>
+      <w:r>
+        <w:rPr>
+          <w:b/>
+          <w:bCs/>
+        </w:rPr>
+        <w:t>feature toggle</w:t>
+      </w:r>
+      <w:r>
+        <w:t xml:space="preserve"> is a mechanism that allows a feature to be turned </w:t>
+      </w:r>
+      <w:r>
+        <w:rPr>
+          <w:b/>
+          <w:bCs/>
+        </w:rPr>
+        <w:t>ON or OFF using configuration</w:t>
+      </w:r>
+      <w:r>
+        <w:t xml:space="preserve"> without changing or redeploying the application.</w:t>
+      </w:r>
+    </w:p>
+    <w:p>
+      <w:r>
+        <w:rPr>
+          <w:b/>
+          <w:bCs/>
+        </w:rPr>
+        <w:t>Important points:</w:t>
+      </w:r>
+    </w:p>
+    <w:p>
+      <w:pPr>
+        <w:numPr>
+          <w:ilvl w:val="0"/>
+          <w:numId w:val="16"/>
+        </w:numPr>
+      </w:pPr>
+      <w:r>
+        <w:t xml:space="preserve">Developers can deploy code while keeping the new feature disabled. </w:t>
+      </w:r>
+    </w:p>
+    <w:p>
+      <w:pPr>
+        <w:numPr>
+          <w:ilvl w:val="0"/>
+          <w:numId w:val="16"/>
+        </w:numPr>
+      </w:pPr>
+      <w:r>
+        <w:t xml:space="preserve">The feature can be enabled when the team is ready. </w:t>
+      </w:r>
+    </w:p>
+    <w:p>
+      <w:pPr>
+        <w:numPr>
+          <w:ilvl w:val="0"/>
+          <w:numId w:val="16"/>
+        </w:numPr>
+      </w:pPr>
+      <w:r>
+        <w:t xml:space="preserve">It can initially be enabled for only a small group of users. </w:t>
+      </w:r>
+    </w:p>
+    <w:p>
+      <w:pPr>
+        <w:numPr>
+          <w:ilvl w:val="0"/>
+          <w:numId w:val="16"/>
+        </w:numPr>
+      </w:pPr>
+      <w:r>
+        <w:t xml:space="preserve">Teams can monitor performance and user feedback. </w:t>
+      </w:r>
+    </w:p>
+    <w:p>
+      <w:pPr>
+        <w:numPr>
+          <w:ilvl w:val="0"/>
+          <w:numId w:val="16"/>
+        </w:numPr>
+      </w:pPr>
+      <w:r>
+        <w:t xml:space="preserve">If everything works correctly, the feature can be enabled for more users. </w:t>
+      </w:r>
+    </w:p>
+    <w:p>
+      <w:pPr>
+        <w:numPr>
+          <w:ilvl w:val="0"/>
+          <w:numId w:val="16"/>
+        </w:numPr>
+      </w:pPr>
+      <w:r>
+        <w:t xml:space="preserve">If something goes wrong, the feature can be disabled quickly. </w:t>
+      </w:r>
+    </w:p>
+    <w:p>
+      <w:pPr>
+        <w:numPr>
+          <w:ilvl w:val="0"/>
+          <w:numId w:val="16"/>
+        </w:numPr>
+      </w:pPr>
+      <w:r>
+        <w:t xml:space="preserve">This provides a simple way to </w:t>
+      </w:r>
+      <w:r>
+        <w:rPr>
+          <w:b/>
+          <w:bCs/>
+        </w:rPr>
+        <w:t>rollback a feature</w:t>
+      </w:r>
+      <w:r>
+        <w:t xml:space="preserve">. </w:t>
+      </w:r>
+    </w:p>
+    <w:p>
+      <w:pPr>
+        <w:numPr>
+          <w:ilvl w:val="0"/>
+          <w:numId w:val="16"/>
+        </w:numPr>
+      </w:pPr>
+      <w:r>
+        <w:t xml:space="preserve">It reduces the risk of releasing new functionality to everyone at once. </w:t>
+      </w:r>
+    </w:p>
+    <w:p>
+      <w:pPr>
+        <w:numPr>
+          <w:ilvl w:val="0"/>
+          <w:numId w:val="16"/>
+        </w:numPr>
+      </w:pPr>
+      <w:r>
+        <w:t xml:space="preserve">Feature toggles are useful for </w:t>
+      </w:r>
+      <w:r>
+        <w:rPr>
+          <w:b/>
+          <w:bCs/>
+        </w:rPr>
+        <w:t>A/B testing, gradual releases, and experimentation</w:t>
+      </w:r>
+      <w:r>
+        <w:t xml:space="preserve">. </w:t>
+      </w:r>
+    </w:p>
+    <w:p>
+      <w:pPr>
+        <w:numPr>
+          <w:ilvl w:val="0"/>
+          <w:numId w:val="16"/>
+        </w:numPr>
+      </w:pPr>
+      <w:r>
+        <w:t xml:space="preserve">Once a feature is stable, the toggle should usually be removed to avoid unnecessary complexity. </w:t>
+      </w:r>
+    </w:p>
+    <w:p>
+      <w:r>
+        <w:rPr>
+          <w:b/>
+          <w:bCs/>
+        </w:rPr>
+        <w:t>Simple example:</w:t>
+      </w:r>
+    </w:p>
+    <w:p>
+      <w:r>
+        <w:t>New Checkout Feature = OFF</w:t>
+      </w:r>
+    </w:p>
+    <w:p>
+      <w:r>
+        <w:lastRenderedPageBreak/>
+        <w:t xml:space="preserve">        ↓</w:t>
+      </w:r>
+    </w:p>
+    <w:p>
+      <w:r>
+        <w:t>Test with developers</w:t>
+      </w:r>
+    </w:p>
+    <w:p>
+      <w:r>
+        <w:t xml:space="preserve">        ↓</w:t>
+      </w:r>
+    </w:p>
+    <w:p>
+      <w:r>
+        <w:t>Enable for 10% users</w:t>
+      </w:r>
+    </w:p>
+    <w:p>
+      <w:r>
+        <w:t xml:space="preserve">        ↓</w:t>
+      </w:r>
+    </w:p>
+    <w:p>
+      <w:r>
+        <w:t>Check results</w:t>
+      </w:r>
+    </w:p>
+    <w:p>
+      <w:r>
+        <w:t xml:space="preserve">        ↓</w:t>
+      </w:r>
+    </w:p>
+    <w:p>
+      <w:r>
+        <w:t>Enable for 100% users</w:t>
+      </w:r>
+    </w:p>
+    <w:p>
+      <w:r>
+        <w:pict w14:anchorId="1C534184">
+          <v:rect id="_x0000_i1066" style="width:0;height:1.5pt" o:hralign="center" o:hrstd="t" o:hr="t" fillcolor="#a0a0a0" stroked="f"/>
+        </w:pict>
+      </w:r>
+    </w:p>
+    <w:p>
+      <w:pPr>
+        <w:rPr>
+          <w:b/>
+          <w:bCs/>
+        </w:rPr>
+      </w:pPr>
+      <w:r>
+        <w:rPr>
+          <w:rFonts w:ascii="Segoe UI Emoji" w:hAnsi="Segoe UI Emoji" w:cs="Segoe UI Emoji"/>
+          <w:b/>
+          <w:bCs/>
+        </w:rPr>
+        <w:t>⚠️</w:t>
+      </w:r>
+      <w:r>
+        <w:rPr>
+          <w:b/>
+          <w:bCs/>
+        </w:rPr>
+        <w:t xml:space="preserve"> Avoiding the Distributed Monolith</w:t>
+      </w:r>
+    </w:p>
+    <w:p>
+      <w:pPr>
+        <w:rPr>
+          <w:b/>
+          <w:bCs/>
+        </w:rPr>
+      </w:pPr>
+      <w:r>
+        <w:rPr>
+          <w:b/>
+          <w:bCs/>
+        </w:rPr>
+        <w:t>Conceptual Question</w:t>
+      </w:r>
+    </w:p>
+    <w:p>
+      <w:r>
+        <w:rPr>
+          <w:b/>
+          <w:bCs/>
+        </w:rPr>
+        <w:t>What architectural mistakes lead to a distributed monolith, and how can teams avoid them?</w:t>
+      </w:r>
+    </w:p>
+    <w:p>
+      <w:pPr>
+        <w:rPr>
+          <w:b/>
+          <w:bCs/>
+        </w:rPr>
+      </w:pPr>
+      <w:r>
+        <w:rPr>
+          <w:b/>
+          <w:bCs/>
+        </w:rPr>
+        <w:t>Answer</w:t>
+      </w:r>
+    </w:p>
+    <w:p>
+      <w:r>
+        <w:t xml:space="preserve">A </w:t>
+      </w:r>
+      <w:r>
+        <w:rPr>
+          <w:b/>
+          <w:bCs/>
+        </w:rPr>
+        <w:t>distributed monolith</w:t>
+      </w:r>
+      <w:r>
+        <w:t xml:space="preserve"> looks like a microservices architecture but behaves like a monolith because the services are </w:t>
+      </w:r>
+      <w:r>
+        <w:rPr>
+          <w:b/>
+          <w:bCs/>
+        </w:rPr>
+        <w:t>too tightly dependent on each other</w:t>
+      </w:r>
+      <w:r>
+        <w:t>.</w:t>
+      </w:r>
+    </w:p>
+    <w:p>
+      <w:r>
+        <w:rPr>
+          <w:b/>
+          <w:bCs/>
+        </w:rPr>
+        <w:t>Important points:</w:t>
+      </w:r>
+    </w:p>
+    <w:p>
+      <w:pPr>
+        <w:numPr>
+          <w:ilvl w:val="0"/>
+          <w:numId w:val="17"/>
+        </w:numPr>
+      </w:pPr>
+      <w:r>
+        <w:t xml:space="preserve">Services depend heavily on other services. </w:t>
+      </w:r>
+    </w:p>
+    <w:p>
+      <w:pPr>
+        <w:numPr>
+          <w:ilvl w:val="0"/>
+          <w:numId w:val="17"/>
+        </w:numPr>
+      </w:pPr>
+      <w:r>
+        <w:t xml:space="preserve">One request may require a long chain of synchronous service calls. </w:t>
+      </w:r>
+    </w:p>
+    <w:p>
+      <w:pPr>
+        <w:numPr>
+          <w:ilvl w:val="0"/>
+          <w:numId w:val="17"/>
+        </w:numPr>
+      </w:pPr>
+      <w:r>
+        <w:t xml:space="preserve">Services may share the same database. </w:t>
+      </w:r>
+    </w:p>
+    <w:p>
+      <w:pPr>
+        <w:numPr>
+          <w:ilvl w:val="0"/>
+          <w:numId w:val="17"/>
+        </w:numPr>
+      </w:pPr>
+      <w:r>
+        <w:t xml:space="preserve">A change in one service may require changes in several other services. </w:t>
+      </w:r>
+    </w:p>
+    <w:p>
+      <w:pPr>
+        <w:numPr>
+          <w:ilvl w:val="0"/>
+          <w:numId w:val="17"/>
+        </w:numPr>
+      </w:pPr>
+      <w:r>
+        <w:t xml:space="preserve">Services may not be independently deployable. </w:t>
+      </w:r>
+    </w:p>
+    <w:p>
+      <w:pPr>
+        <w:numPr>
+          <w:ilvl w:val="0"/>
+          <w:numId w:val="17"/>
+        </w:numPr>
+      </w:pPr>
+      <w:r>
+        <w:t xml:space="preserve">Failure of one service can cause failures across many services. </w:t>
+      </w:r>
+    </w:p>
+    <w:p>
+      <w:pPr>
+        <w:numPr>
+          <w:ilvl w:val="0"/>
+          <w:numId w:val="17"/>
+        </w:numPr>
+      </w:pPr>
+      <w:r>
+        <w:t xml:space="preserve">Excessive communication between services increases complexity. </w:t>
+      </w:r>
+    </w:p>
+    <w:p>
+      <w:pPr>
+        <w:numPr>
+          <w:ilvl w:val="0"/>
+          <w:numId w:val="17"/>
+        </w:numPr>
+      </w:pPr>
+      <w:r>
+        <w:t xml:space="preserve">Services should have </w:t>
+      </w:r>
+      <w:r>
+        <w:rPr>
+          <w:b/>
+          <w:bCs/>
+        </w:rPr>
+        <w:t>clear and independent responsibilities</w:t>
+      </w:r>
+      <w:r>
+        <w:t xml:space="preserve">. </w:t>
+      </w:r>
+    </w:p>
+    <w:p>
+      <w:pPr>
+        <w:numPr>
+          <w:ilvl w:val="0"/>
+          <w:numId w:val="17"/>
+        </w:numPr>
+      </w:pPr>
+      <w:r>
+        <w:t xml:space="preserve">Each service should ideally own its own data. </w:t>
+      </w:r>
+    </w:p>
+    <w:p>
+      <w:pPr>
+        <w:numPr>
+          <w:ilvl w:val="0"/>
+          <w:numId w:val="17"/>
+        </w:numPr>
+      </w:pPr>
+      <w:r>
+        <w:t xml:space="preserve">Avoid unnecessary synchronous communication. </w:t>
+      </w:r>
+    </w:p>
+    <w:p>
+      <w:pPr>
+        <w:numPr>
+          <w:ilvl w:val="0"/>
+          <w:numId w:val="17"/>
+        </w:numPr>
+      </w:pPr>
+      <w:r>
+        <w:t xml:space="preserve">Use asynchronous communication such as </w:t>
+      </w:r>
+      <w:r>
+        <w:rPr>
+          <w:b/>
+          <w:bCs/>
+        </w:rPr>
+        <w:t>Kafka or messaging</w:t>
+      </w:r>
+      <w:r>
+        <w:t xml:space="preserve"> where appropriate. </w:t>
+      </w:r>
+    </w:p>
+    <w:p>
+      <w:pPr>
+        <w:numPr>
+          <w:ilvl w:val="0"/>
+          <w:numId w:val="17"/>
+        </w:numPr>
+      </w:pPr>
+      <w:r>
+        <w:t xml:space="preserve">Services should be independently testable and deployable. </w:t>
+      </w:r>
+    </w:p>
+    <w:p>
+      <w:pPr>
+        <w:numPr>
+          <w:ilvl w:val="0"/>
+          <w:numId w:val="17"/>
+        </w:numPr>
+      </w:pPr>
+      <w:r>
+        <w:t xml:space="preserve">The goal is </w:t>
+      </w:r>
+      <w:r>
+        <w:rPr>
+          <w:b/>
+          <w:bCs/>
+        </w:rPr>
+        <w:t>loose coupling and high independence</w:t>
+      </w:r>
+      <w:r>
+        <w:t xml:space="preserve">. </w:t>
+      </w:r>
+    </w:p>
+    <w:p>
+      <w:r>
+        <w:rPr>
+          <w:b/>
+          <w:bCs/>
+        </w:rPr>
+        <w:lastRenderedPageBreak/>
+        <w:t>Simple comparison:</w:t>
+      </w:r>
+    </w:p>
+    <w:p>
+      <w:pPr>
+        <w:rPr>
+          <w:b/>
+          <w:bCs/>
+        </w:rPr>
+      </w:pPr>
+      <w:r>
+        <w:rPr>
+          <w:b/>
+          <w:bCs/>
+        </w:rPr>
+        <w:t>Distributed Monolith</w:t>
+      </w:r>
+    </w:p>
+    <w:p>
+      <w:r>
+        <w:t>Service A → Service B → Service C → Service D</w:t>
+      </w:r>
+    </w:p>
+    <w:p>
+      <w:r>
+        <w:t xml:space="preserve">    ↓           ↓           ↓</w:t>
+      </w:r>
+    </w:p>
+    <w:p>
+      <w:r>
+        <w:t xml:space="preserve"> Shared Database</w:t>
+      </w:r>
+    </w:p>
+    <w:p>
+      <w:r>
+        <w:t>Everything depends on everything else.</w:t>
+      </w:r>
+    </w:p>
+    <w:p>
+      <w:pPr>
+        <w:rPr>
+          <w:b/>
+          <w:bCs/>
+        </w:rPr>
+      </w:pPr>
+      <w:r>
+        <w:rPr>
+          <w:b/>
+          <w:bCs/>
+        </w:rPr>
+        <w:t>Better Microservices Design</w:t>
+      </w:r>
+    </w:p>
+    <w:p>
+      <w:r>
+        <w:t>Service A ←→ Message/API ←→ Service B</w:t>
+      </w:r>
+    </w:p>
+    <w:p/>
+    <w:p>
+      <w:r>
+        <w:t>Service A → Own Data</w:t>
+      </w:r>
+    </w:p>
+    <w:p>
+      <w:r>
+        <w:t>Service B → Own Data</w:t>
+      </w:r>
+    </w:p>
+    <w:p>
+      <w:r>
+        <w:t>Each service has a clear responsibility and fewer direct dependencies.</w:t>
+      </w:r>
+    </w:p>
+    <w:p/>
+    <w:p/>
+    <w:p/>
+    <w:p/>
+    <w:p/>
+    <w:p/>
+    <w:p/>
+    <w:p/>
+    <w:p/>
+    <w:p/>
+    <w:p/>
+    <w:p/>
+    <w:p/>
+    <w:p/>
+    <w:p/>
+    <w:p/>
+    <w:p/>
+    <w:p>
+      <w:pPr>
+        <w:rPr>
+          <w:b/>
+          <w:bCs/>
+          <w:sz w:val="48"/>
+          <w:szCs w:val="48"/>
+        </w:rPr>
+      </w:pPr>
+      <w:r>
+        <w:rPr>
+          <w:b/>
+          <w:bCs/>
+          <w:sz w:val="48"/>
+          <w:szCs w:val="48"/>
+        </w:rPr>
+        <w:lastRenderedPageBreak/>
+        <w:t>Home Tasks:</w:t>
+      </w:r>
+    </w:p>
+    <w:p>
+      <w:pPr>
+        <w:rPr>
+          <w:b/>
+          <w:bCs/>
+          <w:sz w:val="48"/>
+          <w:szCs w:val="48"/>
+        </w:rPr>
+      </w:pPr>
+    </w:p>
+    <w:p>
+      <w:pPr>
+        <w:rPr>
+          <w:b/>
+          <w:bCs/>
+        </w:rPr>
+      </w:pPr>
+      <w:r>
+        <w:rPr>
+          <w:b/>
+          <w:bCs/>
+        </w:rPr>
+        <w:t>Decomposing a Monolith into Microservices</w:t>
+      </w:r>
+    </w:p>
+    <w:p>
+      <w:pPr>
+        <w:rPr>
+          <w:b/>
+          <w:bCs/>
+        </w:rPr>
+      </w:pPr>
+      <w:r>
+        <w:rPr>
+          <w:b/>
+          <w:bCs/>
+        </w:rPr>
+        <w:t>Conceptual Questions and Answers</w:t>
+      </w:r>
+    </w:p>
+    <w:p>
+      <w:pPr>
+        <w:rPr>
+          <w:b/>
+          <w:bCs/>
+        </w:rPr>
+      </w:pPr>
+      <w:r>
+        <w:rPr>
+          <w:b/>
+          <w:bCs/>
+        </w:rPr>
+        <w:t>1. What challenges arise when decomposing a monolith into microservices without proper domain analysis?</w:t>
+      </w:r>
+    </w:p>
+    <w:p>
+      <w:r>
+        <w:t>Breaking a monolith into microservices without understanding the business domain can create several problems:</w:t>
+      </w:r>
+    </w:p>
+    <w:p>
+      <w:pPr>
+        <w:numPr>
+          <w:ilvl w:val="0"/>
+          <w:numId w:val="18"/>
+        </w:numPr>
+      </w:pPr>
+      <w:r>
+        <w:rPr>
+          <w:b/>
+          <w:bCs/>
+        </w:rPr>
+        <w:t>Wrong service boundaries:</w:t>
+      </w:r>
+      <w:r>
+        <w:t xml:space="preserve"> Services may be divided based on database tables or code instead of actual business responsibilities.</w:t>
+      </w:r>
+    </w:p>
+    <w:p>
+      <w:pPr>
+        <w:numPr>
+          <w:ilvl w:val="0"/>
+          <w:numId w:val="18"/>
+        </w:numPr>
+      </w:pPr>
+      <w:r>
+        <w:rPr>
+          <w:b/>
+          <w:bCs/>
+        </w:rPr>
+        <w:t>High coupling:</w:t>
+      </w:r>
+      <w:r>
+        <w:t xml:space="preserve"> Services may depend heavily on each other, resulting in frequent API calls and increased complexity.</w:t>
+      </w:r>
+    </w:p>
+    <w:p>
+      <w:pPr>
+        <w:numPr>
+          <w:ilvl w:val="0"/>
+          <w:numId w:val="18"/>
+        </w:numPr>
+      </w:pPr>
+      <w:r>
+        <w:rPr>
+          <w:b/>
+          <w:bCs/>
+        </w:rPr>
+        <w:t>Data ownership issues:</w:t>
+      </w:r>
+      <w:r>
+        <w:t xml:space="preserve"> It may be unclear which service should own and manage specific data.</w:t>
+      </w:r>
+    </w:p>
+    <w:p>
+      <w:pPr>
+        <w:numPr>
+          <w:ilvl w:val="0"/>
+          <w:numId w:val="18"/>
+        </w:numPr>
+      </w:pPr>
+      <w:r>
+        <w:rPr>
+          <w:b/>
+          <w:bCs/>
+        </w:rPr>
+        <w:t>Duplicate business logic:</w:t>
+      </w:r>
+      <w:r>
+        <w:t xml:space="preserve"> The same business rules may be implemented in multiple services, making maintenance difficult.</w:t>
+      </w:r>
+    </w:p>
+    <w:p>
+      <w:pPr>
+        <w:numPr>
+          <w:ilvl w:val="0"/>
+          <w:numId w:val="18"/>
+        </w:numPr>
+      </w:pPr>
+      <w:r>
+        <w:rPr>
+          <w:b/>
+          <w:bCs/>
+        </w:rPr>
+        <w:t>Transaction problems:</w:t>
+      </w:r>
+      <w:r>
+        <w:t xml:space="preserve"> Operations that were previously handled in one transaction may now involve multiple services and databases.</w:t>
+      </w:r>
+    </w:p>
+    <w:p>
+      <w:pPr>
+        <w:numPr>
+          <w:ilvl w:val="0"/>
+          <w:numId w:val="18"/>
+        </w:numPr>
+      </w:pPr>
+      <w:r>
+        <w:rPr>
+          <w:b/>
+          <w:bCs/>
+        </w:rPr>
+        <w:t>Testing and debugging difficulties:</w:t>
+      </w:r>
+      <w:r>
+        <w:t xml:space="preserve"> Failures become harder to trace because a single business operation may involve several services.</w:t>
+      </w:r>
+    </w:p>
+    <w:p>
+      <w:pPr>
+        <w:numPr>
+          <w:ilvl w:val="0"/>
+          <w:numId w:val="18"/>
+        </w:numPr>
+      </w:pPr>
+      <w:r>
+        <w:rPr>
+          <w:b/>
+          <w:bCs/>
+        </w:rPr>
+        <w:t>Operational complexity:</w:t>
+      </w:r>
+      <w:r>
+        <w:t xml:space="preserve"> More services require additional monitoring, logging, deployment, security, and service-management practices.</w:t>
+      </w:r>
+    </w:p>
+    <w:p>
+      <w:r>
+        <w:t xml:space="preserve">Overall, without proper domain analysis, microservices can become a </w:t>
+      </w:r>
+      <w:r>
+        <w:rPr>
+          <w:b/>
+          <w:bCs/>
+        </w:rPr>
+        <w:t>distributed monolith</w:t>
+      </w:r>
+      <w:r>
+        <w:t>—many separate services that are still tightly dependent on each other.</w:t>
+      </w:r>
+    </w:p>
+    <w:p>
+      <w:r>
+        <w:pict w14:anchorId="45C09DA1">
+          <v:rect id="_x0000_i1079" style="width:0;height:1.5pt" o:hralign="center" o:hrstd="t" o:hr="t" fillcolor="#a0a0a0" stroked="f"/>
+        </w:pict>
+      </w:r>
+    </w:p>
+    <w:p>
+      <w:pPr>
+        <w:rPr>
+          <w:b/>
+          <w:bCs/>
+        </w:rPr>
+      </w:pPr>
+      <w:r>
+        <w:rPr>
+          <w:b/>
+          <w:bCs/>
+        </w:rPr>
+        <w:t>2. How does DDD guide the identification of microservice boundaries?</w:t>
+      </w:r>
+    </w:p>
+    <w:p>
+      <w:r>
+        <w:rPr>
+          <w:b/>
+          <w:bCs/>
+        </w:rPr>
+        <w:t>Domain-Driven Design (DDD)</w:t>
+      </w:r>
+      <w:r>
+        <w:t xml:space="preserve"> helps identify microservice boundaries by focusing on the business domain rather than only on the technical structure of the application.</w:t>
+      </w:r>
+    </w:p>
+    <w:p>
+      <w:r>
+        <w:t>Important DDD concepts include:</w:t>
+      </w:r>
+    </w:p>
+    <w:p>
+      <w:pPr>
+        <w:numPr>
+          <w:ilvl w:val="0"/>
+          <w:numId w:val="19"/>
+        </w:numPr>
+      </w:pPr>
+      <w:r>
+        <w:rPr>
+          <w:b/>
+          <w:bCs/>
+        </w:rPr>
+        <w:t>Bounded Contexts:</w:t>
+      </w:r>
+      <w:r>
+        <w:t xml:space="preserve"> Define clear boundaries around different business areas, such as Orders, Payments, Inventory, and Shipping.</w:t>
+      </w:r>
+    </w:p>
+    <w:p>
+      <w:pPr>
+        <w:numPr>
+          <w:ilvl w:val="0"/>
+          <w:numId w:val="19"/>
+        </w:numPr>
+      </w:pPr>
+      <w:r>
+        <w:rPr>
+          <w:b/>
+          <w:bCs/>
+        </w:rPr>
+        <w:lastRenderedPageBreak/>
+        <w:t>Business Capabilities:</w:t>
+      </w:r>
+      <w:r>
+        <w:t xml:space="preserve"> Identify what the business </w:t>
+      </w:r>
+      <w:proofErr w:type="gramStart"/>
+      <w:r>
+        <w:t>actually does</w:t>
+      </w:r>
+      <w:proofErr w:type="gramEnd"/>
+      <w:r>
+        <w:t xml:space="preserve"> and use these capabilities to guide service boundaries.</w:t>
+      </w:r>
+    </w:p>
+    <w:p>
+      <w:pPr>
+        <w:numPr>
+          <w:ilvl w:val="0"/>
+          <w:numId w:val="19"/>
+        </w:numPr>
+      </w:pPr>
+      <w:r>
+        <w:rPr>
+          <w:b/>
+          <w:bCs/>
+        </w:rPr>
+        <w:t>Domain Models:</w:t>
+      </w:r>
+      <w:r>
+        <w:t xml:space="preserve"> Keep business rules and concepts related to a particular domain together.</w:t>
+      </w:r>
+    </w:p>
+    <w:p>
+      <w:pPr>
+        <w:numPr>
+          <w:ilvl w:val="0"/>
+          <w:numId w:val="19"/>
+        </w:numPr>
+      </w:pPr>
+      <w:r>
+        <w:rPr>
+          <w:b/>
+          <w:bCs/>
+        </w:rPr>
+        <w:t>Ubiquitous Language:</w:t>
+      </w:r>
+      <w:r>
+        <w:t xml:space="preserve"> Use common business terminology so developers and business teams have the same understanding.</w:t>
+      </w:r>
+    </w:p>
+    <w:p>
+      <w:pPr>
+        <w:numPr>
+          <w:ilvl w:val="0"/>
+          <w:numId w:val="19"/>
+        </w:numPr>
+      </w:pPr>
+      <w:r>
+        <w:rPr>
+          <w:b/>
+          <w:bCs/>
+        </w:rPr>
+        <w:t>High Cohesion:</w:t>
+      </w:r>
+      <w:r>
+        <w:t xml:space="preserve"> Keep closely related functionality within the same service.</w:t>
+      </w:r>
+    </w:p>
+    <w:p>
+      <w:pPr>
+        <w:numPr>
+          <w:ilvl w:val="0"/>
+          <w:numId w:val="19"/>
+        </w:numPr>
+      </w:pPr>
+      <w:r>
+        <w:rPr>
+          <w:b/>
+          <w:bCs/>
+        </w:rPr>
+        <w:t>Low Coupling:</w:t>
+      </w:r>
+      <w:r>
+        <w:t xml:space="preserve"> Minimize unnecessary dependencies between services.</w:t>
+      </w:r>
+    </w:p>
+    <w:p>
+      <w:pPr>
+        <w:numPr>
+          <w:ilvl w:val="0"/>
+          <w:numId w:val="19"/>
+        </w:numPr>
+      </w:pPr>
+      <w:r>
+        <w:rPr>
+          <w:b/>
+          <w:bCs/>
+        </w:rPr>
+        <w:t>Data Ownership:</w:t>
+      </w:r>
+      <w:r>
+        <w:t xml:space="preserve"> Each service should ideally own and manage the data related to its business responsibility.</w:t>
+      </w:r>
+    </w:p>
+    <w:p>
+      <w:r>
+        <w:t xml:space="preserve">For example, in an e-commerce system, </w:t>
+      </w:r>
+      <w:r>
+        <w:rPr>
+          <w:b/>
+          <w:bCs/>
+        </w:rPr>
+        <w:t>Order Management</w:t>
+      </w:r>
+      <w:r>
+        <w:t xml:space="preserve"> can become an Order Service, while </w:t>
+      </w:r>
+      <w:r>
+        <w:rPr>
+          <w:b/>
+          <w:bCs/>
+        </w:rPr>
+        <w:t>Payment</w:t>
+      </w:r>
+      <w:r>
+        <w:t xml:space="preserve"> and </w:t>
+      </w:r>
+      <w:r>
+        <w:rPr>
+          <w:b/>
+          <w:bCs/>
+        </w:rPr>
+        <w:t>Inventory</w:t>
+      </w:r>
+      <w:r>
+        <w:t xml:space="preserve"> can have their own services.</w:t>
+      </w:r>
+    </w:p>
+    <w:p>
+      <w:pPr>
+        <w:rPr>
+          <w:b/>
+          <w:bCs/>
+        </w:rPr>
+      </w:pPr>
+      <w:r>
+        <w:rPr>
+          <w:b/>
+          <w:bCs/>
+        </w:rPr>
+        <w:t>Conclusion</w:t>
+      </w:r>
+    </w:p>
+    <w:p>
+      <w:r>
+        <w:t xml:space="preserve">DDD helps teams understand the business first and then define meaningful microservice boundaries. The goal is not to create many small services, but to create </w:t>
+      </w:r>
+      <w:r>
+        <w:rPr>
+          <w:b/>
+          <w:bCs/>
+        </w:rPr>
+        <w:t>independent services with clear responsibilities and minimal unnecessary dependencies</w:t>
+      </w:r>
+      <w:r>
+        <w:t>.</w:t>
       </w:r>
     </w:p>
     <w:p/>
@@ -7270,6 +9722,155 @@
 <file path=word/numbering.xml><?xml version="1.0" encoding="utf-8"?>
 <w:numbering xmlns:wpc="http://schemas.microsoft.com/office/word/2010/wordprocessingCanvas" xmlns:cx="http://schemas.microsoft.com/office/drawing/2014/chartex" xmlns:cx1="http://schemas.microsoft.com/office/drawing/2015/9/8/chartex" xmlns:cx2="http://schemas.microsoft.com/office/drawing/2015/10/21/chartex" xmlns:cx3="http://schemas.microsoft.com/office/drawing/2016/5/9/chartex" xmlns:cx4="http://schemas.microsoft.com/office/drawing/2016/5/10/chartex" xmlns:cx5="http://schemas.microsoft.com/office/drawing/2016/5/11/chartex" xmlns:cx6="http://schemas.microsoft.com/office/drawing/2016/5/12/chartex" xmlns:cx7="http://schemas.microsoft.com/office/drawing/2016/5/13/chartex" xmlns:cx8="http://schemas.microsoft.com/office/drawing/2016/5/14/chartex" xmlns:mc="http://schemas.openxmlformats.org/markup-compatibility/2006" xmlns:aink="http://schemas.microsoft.com/office/drawing/2016/ink" xmlns:am3d="http://schemas.microsoft.com/office/drawing/2017/model3d" xmlns:o="urn:schemas-microsoft-com:office:office" xmlns:oel="http://schemas.microsoft.com/office/2019/extlst" xmlns:r="http://schemas.openxmlformats.org/officeDocument/2006/relationships" xmlns:m="http://schemas.openxmlformats.org/officeDocument/2006/math" xmlns:v="urn:schemas-microsoft-com:vml" xmlns:wp14="http://schemas.microsoft.com/office/word/2010/wordprocessingDrawing" xmlns:wp="http://schemas.openxmlformats.org/drawingml/2006/wordprocessingDrawing" xmlns:w10="urn:schemas-microsoft-com:office:word" xmlns:w="http://schemas.openxmlformats.org/wordprocessingml/2006/main" xmlns:w14="http://schemas.microsoft.com/office/word/2010/wordml" xmlns:w15="http://schemas.microsoft.com/office/word/2012/wordml" xmlns:w16cei="http://schemas.microsoft.com/office/word/2026/wordml/cei" xmlns:w16cex="http://schemas.microsoft.com/office/word/2018/wordml/cex" xmlns:w16cid="http://schemas.microsoft.com/office/word/2016/wordml/cid" xmlns:w16="http://schemas.microsoft.com/office/word/2018/wordml" xmlns:w16du="http://schemas.microsoft.com/office/word/2023/wordml/word16du" xmlns:w16sdtdh="http://schemas.microsoft.com/office/word/2020/wordml/sdtdatahash" xmlns:w16sdtfl="http://schemas.microsoft.com/office/word/2024/wordml/sdtformatlock" xmlns:w16se="http://schemas.microsoft.com/office/word/2015/wordml/symex" xmlns:wpg="http://schemas.microsoft.com/office/word/2010/wordprocessingGroup" xmlns:wpi="http://schemas.microsoft.com/office/word/2010/wordprocessingInk" xmlns:wne="http://schemas.microsoft.com/office/word/2006/wordml" xmlns:wps="http://schemas.microsoft.com/office/word/2010/wordprocessingShape" mc:Ignorable="w14 w15 w16se w16cid w16 w16cex w16sdtdh w16sdtfl w16du wp14">
   <w:abstractNum w:abstractNumId="0" w15:restartNumberingAfterBreak="0">
+    <w:nsid w:val="040155ED"/>
+    <w:multiLevelType w:val="multilevel"/>
+    <w:tmpl w:val="35DA4E56"/>
+    <w:lvl w:ilvl="0">
+      <w:start w:val="1"/>
+      <w:numFmt w:val="bullet"/>
+      <w:lvlText w:val=""/>
+      <w:lvlJc w:val="left"/>
+      <w:pPr>
+        <w:tabs>
+          <w:tab w:val="num" w:pos="720"/>
+        </w:tabs>
+        <w:ind w:left="720" w:hanging="360"/>
+      </w:pPr>
+      <w:rPr>
+        <w:rFonts w:ascii="Symbol" w:hAnsi="Symbol" w:hint="default"/>
+        <w:sz w:val="20"/>
+      </w:rPr>
+    </w:lvl>
+    <w:lvl w:ilvl="1" w:tentative="1">
+      <w:start w:val="1"/>
+      <w:numFmt w:val="bullet"/>
+      <w:lvlText w:val="o"/>
+      <w:lvlJc w:val="left"/>
+      <w:pPr>
+        <w:tabs>
+          <w:tab w:val="num" w:pos="1440"/>
+        </w:tabs>
+        <w:ind w:left="1440" w:hanging="360"/>
+      </w:pPr>
+      <w:rPr>
+        <w:rFonts w:ascii="Courier New" w:hAnsi="Courier New" w:hint="default"/>
+        <w:sz w:val="20"/>
+      </w:rPr>
+    </w:lvl>
+    <w:lvl w:ilvl="2" w:tentative="1">
+      <w:start w:val="1"/>
+      <w:numFmt w:val="bullet"/>
+      <w:lvlText w:val=""/>
+      <w:lvlJc w:val="left"/>
+      <w:pPr>
+        <w:tabs>
+          <w:tab w:val="num" w:pos="2160"/>
+        </w:tabs>
+        <w:ind w:left="2160" w:hanging="360"/>
+      </w:pPr>
+      <w:rPr>
+        <w:rFonts w:ascii="Wingdings" w:hAnsi="Wingdings" w:hint="default"/>
+        <w:sz w:val="20"/>
+      </w:rPr>
+    </w:lvl>
+    <w:lvl w:ilvl="3" w:tentative="1">
+      <w:start w:val="1"/>
+      <w:numFmt w:val="bullet"/>
+      <w:lvlText w:val=""/>
+      <w:lvlJc w:val="left"/>
+      <w:pPr>
+        <w:tabs>
+          <w:tab w:val="num" w:pos="2880"/>
+        </w:tabs>
+        <w:ind w:left="2880" w:hanging="360"/>
+      </w:pPr>
+      <w:rPr>
+        <w:rFonts w:ascii="Wingdings" w:hAnsi="Wingdings" w:hint="default"/>
+        <w:sz w:val="20"/>
+      </w:rPr>
+    </w:lvl>
+    <w:lvl w:ilvl="4" w:tentative="1">
+      <w:start w:val="1"/>
+      <w:numFmt w:val="bullet"/>
+      <w:lvlText w:val=""/>
+      <w:lvlJc w:val="left"/>
+      <w:pPr>
+        <w:tabs>
+          <w:tab w:val="num" w:pos="3600"/>
+        </w:tabs>
+        <w:ind w:left="3600" w:hanging="360"/>
+      </w:pPr>
+      <w:rPr>
+        <w:rFonts w:ascii="Wingdings" w:hAnsi="Wingdings" w:hint="default"/>
+        <w:sz w:val="20"/>
+      </w:rPr>
+    </w:lvl>
+    <w:lvl w:ilvl="5" w:tentative="1">
+      <w:start w:val="1"/>
+      <w:numFmt w:val="bullet"/>
+      <w:lvlText w:val=""/>
+      <w:lvlJc w:val="left"/>
+      <w:pPr>
+        <w:tabs>
+          <w:tab w:val="num" w:pos="4320"/>
+        </w:tabs>
+        <w:ind w:left="4320" w:hanging="360"/>
+      </w:pPr>
+      <w:rPr>
+        <w:rFonts w:ascii="Wingdings" w:hAnsi="Wingdings" w:hint="default"/>
+        <w:sz w:val="20"/>
+      </w:rPr>
+    </w:lvl>
+    <w:lvl w:ilvl="6" w:tentative="1">
+      <w:start w:val="1"/>
+      <w:numFmt w:val="bullet"/>
+      <w:lvlText w:val=""/>
+      <w:lvlJc w:val="left"/>
+      <w:pPr>
+        <w:tabs>
+          <w:tab w:val="num" w:pos="5040"/>
+        </w:tabs>
+        <w:ind w:left="5040" w:hanging="360"/>
+      </w:pPr>
+      <w:rPr>
+        <w:rFonts w:ascii="Wingdings" w:hAnsi="Wingdings" w:hint="default"/>
+        <w:sz w:val="20"/>
+      </w:rPr>
+    </w:lvl>
+    <w:lvl w:ilvl="7" w:tentative="1">
+      <w:start w:val="1"/>
+      <w:numFmt w:val="bullet"/>
+      <w:lvlText w:val=""/>
+      <w:lvlJc w:val="left"/>
+      <w:pPr>
+        <w:tabs>
+          <w:tab w:val="num" w:pos="5760"/>
+        </w:tabs>
+        <w:ind w:left="5760" w:hanging="360"/>
+      </w:pPr>
+      <w:rPr>
+        <w:rFonts w:ascii="Wingdings" w:hAnsi="Wingdings" w:hint="default"/>
+        <w:sz w:val="20"/>
+      </w:rPr>
+    </w:lvl>
+    <w:lvl w:ilvl="8" w:tentative="1">
+      <w:start w:val="1"/>
+      <w:numFmt w:val="bullet"/>
+      <w:lvlText w:val=""/>
+      <w:lvlJc w:val="left"/>
+      <w:pPr>
+        <w:tabs>
+          <w:tab w:val="num" w:pos="6480"/>
+        </w:tabs>
+        <w:ind w:left="6480" w:hanging="360"/>
+      </w:pPr>
+      <w:rPr>
+        <w:rFonts w:ascii="Wingdings" w:hAnsi="Wingdings" w:hint="default"/>
+        <w:sz w:val="20"/>
+      </w:rPr>
+    </w:lvl>
+  </w:abstractNum>
+  <w:abstractNum w:abstractNumId="1" w15:restartNumberingAfterBreak="0">
     <w:nsid w:val="083930DF"/>
     <w:multiLevelType w:val="hybridMultilevel"/>
     <w:tmpl w:val="BF28075E"/>
@@ -7382,7 +9983,305 @@
       </w:rPr>
     </w:lvl>
   </w:abstractNum>
-  <w:abstractNum w:abstractNumId="1" w15:restartNumberingAfterBreak="0">
+  <w:abstractNum w:abstractNumId="2" w15:restartNumberingAfterBreak="0">
+    <w:nsid w:val="0F6B2F25"/>
+    <w:multiLevelType w:val="multilevel"/>
+    <w:tmpl w:val="A5FAD324"/>
+    <w:lvl w:ilvl="0">
+      <w:start w:val="1"/>
+      <w:numFmt w:val="bullet"/>
+      <w:lvlText w:val=""/>
+      <w:lvlJc w:val="left"/>
+      <w:pPr>
+        <w:tabs>
+          <w:tab w:val="num" w:pos="720"/>
+        </w:tabs>
+        <w:ind w:left="720" w:hanging="360"/>
+      </w:pPr>
+      <w:rPr>
+        <w:rFonts w:ascii="Symbol" w:hAnsi="Symbol" w:hint="default"/>
+        <w:sz w:val="20"/>
+      </w:rPr>
+    </w:lvl>
+    <w:lvl w:ilvl="1" w:tentative="1">
+      <w:start w:val="1"/>
+      <w:numFmt w:val="bullet"/>
+      <w:lvlText w:val="o"/>
+      <w:lvlJc w:val="left"/>
+      <w:pPr>
+        <w:tabs>
+          <w:tab w:val="num" w:pos="1440"/>
+        </w:tabs>
+        <w:ind w:left="1440" w:hanging="360"/>
+      </w:pPr>
+      <w:rPr>
+        <w:rFonts w:ascii="Courier New" w:hAnsi="Courier New" w:hint="default"/>
+        <w:sz w:val="20"/>
+      </w:rPr>
+    </w:lvl>
+    <w:lvl w:ilvl="2" w:tentative="1">
+      <w:start w:val="1"/>
+      <w:numFmt w:val="bullet"/>
+      <w:lvlText w:val=""/>
+      <w:lvlJc w:val="left"/>
+      <w:pPr>
+        <w:tabs>
+          <w:tab w:val="num" w:pos="2160"/>
+        </w:tabs>
+        <w:ind w:left="2160" w:hanging="360"/>
+      </w:pPr>
+      <w:rPr>
+        <w:rFonts w:ascii="Wingdings" w:hAnsi="Wingdings" w:hint="default"/>
+        <w:sz w:val="20"/>
+      </w:rPr>
+    </w:lvl>
+    <w:lvl w:ilvl="3" w:tentative="1">
+      <w:start w:val="1"/>
+      <w:numFmt w:val="bullet"/>
+      <w:lvlText w:val=""/>
+      <w:lvlJc w:val="left"/>
+      <w:pPr>
+        <w:tabs>
+          <w:tab w:val="num" w:pos="2880"/>
+        </w:tabs>
+        <w:ind w:left="2880" w:hanging="360"/>
+      </w:pPr>
+      <w:rPr>
+        <w:rFonts w:ascii="Wingdings" w:hAnsi="Wingdings" w:hint="default"/>
+        <w:sz w:val="20"/>
+      </w:rPr>
+    </w:lvl>
+    <w:lvl w:ilvl="4" w:tentative="1">
+      <w:start w:val="1"/>
+      <w:numFmt w:val="bullet"/>
+      <w:lvlText w:val=""/>
+      <w:lvlJc w:val="left"/>
+      <w:pPr>
+        <w:tabs>
+          <w:tab w:val="num" w:pos="3600"/>
+        </w:tabs>
+        <w:ind w:left="3600" w:hanging="360"/>
+      </w:pPr>
+      <w:rPr>
+        <w:rFonts w:ascii="Wingdings" w:hAnsi="Wingdings" w:hint="default"/>
+        <w:sz w:val="20"/>
+      </w:rPr>
+    </w:lvl>
+    <w:lvl w:ilvl="5" w:tentative="1">
+      <w:start w:val="1"/>
+      <w:numFmt w:val="bullet"/>
+      <w:lvlText w:val=""/>
+      <w:lvlJc w:val="left"/>
+      <w:pPr>
+        <w:tabs>
+          <w:tab w:val="num" w:pos="4320"/>
+        </w:tabs>
+        <w:ind w:left="4320" w:hanging="360"/>
+      </w:pPr>
+      <w:rPr>
+        <w:rFonts w:ascii="Wingdings" w:hAnsi="Wingdings" w:hint="default"/>
+        <w:sz w:val="20"/>
+      </w:rPr>
+    </w:lvl>
+    <w:lvl w:ilvl="6" w:tentative="1">
+      <w:start w:val="1"/>
+      <w:numFmt w:val="bullet"/>
+      <w:lvlText w:val=""/>
+      <w:lvlJc w:val="left"/>
+      <w:pPr>
+        <w:tabs>
+          <w:tab w:val="num" w:pos="5040"/>
+        </w:tabs>
+        <w:ind w:left="5040" w:hanging="360"/>
+      </w:pPr>
+      <w:rPr>
+        <w:rFonts w:ascii="Wingdings" w:hAnsi="Wingdings" w:hint="default"/>
+        <w:sz w:val="20"/>
+      </w:rPr>
+    </w:lvl>
+    <w:lvl w:ilvl="7" w:tentative="1">
+      <w:start w:val="1"/>
+      <w:numFmt w:val="bullet"/>
+      <w:lvlText w:val=""/>
+      <w:lvlJc w:val="left"/>
+      <w:pPr>
+        <w:tabs>
+          <w:tab w:val="num" w:pos="5760"/>
+        </w:tabs>
+        <w:ind w:left="5760" w:hanging="360"/>
+      </w:pPr>
+      <w:rPr>
+        <w:rFonts w:ascii="Wingdings" w:hAnsi="Wingdings" w:hint="default"/>
+        <w:sz w:val="20"/>
+      </w:rPr>
+    </w:lvl>
+    <w:lvl w:ilvl="8" w:tentative="1">
+      <w:start w:val="1"/>
+      <w:numFmt w:val="bullet"/>
+      <w:lvlText w:val=""/>
+      <w:lvlJc w:val="left"/>
+      <w:pPr>
+        <w:tabs>
+          <w:tab w:val="num" w:pos="6480"/>
+        </w:tabs>
+        <w:ind w:left="6480" w:hanging="360"/>
+      </w:pPr>
+      <w:rPr>
+        <w:rFonts w:ascii="Wingdings" w:hAnsi="Wingdings" w:hint="default"/>
+        <w:sz w:val="20"/>
+      </w:rPr>
+    </w:lvl>
+  </w:abstractNum>
+  <w:abstractNum w:abstractNumId="3" w15:restartNumberingAfterBreak="0">
+    <w:nsid w:val="145A0824"/>
+    <w:multiLevelType w:val="multilevel"/>
+    <w:tmpl w:val="D996CFB6"/>
+    <w:lvl w:ilvl="0">
+      <w:start w:val="1"/>
+      <w:numFmt w:val="bullet"/>
+      <w:lvlText w:val=""/>
+      <w:lvlJc w:val="left"/>
+      <w:pPr>
+        <w:tabs>
+          <w:tab w:val="num" w:pos="720"/>
+        </w:tabs>
+        <w:ind w:left="720" w:hanging="360"/>
+      </w:pPr>
+      <w:rPr>
+        <w:rFonts w:ascii="Symbol" w:hAnsi="Symbol" w:hint="default"/>
+        <w:sz w:val="20"/>
+      </w:rPr>
+    </w:lvl>
+    <w:lvl w:ilvl="1" w:tentative="1">
+      <w:start w:val="1"/>
+      <w:numFmt w:val="bullet"/>
+      <w:lvlText w:val="o"/>
+      <w:lvlJc w:val="left"/>
+      <w:pPr>
+        <w:tabs>
+          <w:tab w:val="num" w:pos="1440"/>
+        </w:tabs>
+        <w:ind w:left="1440" w:hanging="360"/>
+      </w:pPr>
+      <w:rPr>
+        <w:rFonts w:ascii="Courier New" w:hAnsi="Courier New" w:hint="default"/>
+        <w:sz w:val="20"/>
+      </w:rPr>
+    </w:lvl>
+    <w:lvl w:ilvl="2" w:tentative="1">
+      <w:start w:val="1"/>
+      <w:numFmt w:val="bullet"/>
+      <w:lvlText w:val=""/>
+      <w:lvlJc w:val="left"/>
+      <w:pPr>
+        <w:tabs>
+          <w:tab w:val="num" w:pos="2160"/>
+        </w:tabs>
+        <w:ind w:left="2160" w:hanging="360"/>
+      </w:pPr>
+      <w:rPr>
+        <w:rFonts w:ascii="Wingdings" w:hAnsi="Wingdings" w:hint="default"/>
+        <w:sz w:val="20"/>
+      </w:rPr>
+    </w:lvl>
+    <w:lvl w:ilvl="3" w:tentative="1">
+      <w:start w:val="1"/>
+      <w:numFmt w:val="bullet"/>
+      <w:lvlText w:val=""/>
+      <w:lvlJc w:val="left"/>
+      <w:pPr>
+        <w:tabs>
+          <w:tab w:val="num" w:pos="2880"/>
+        </w:tabs>
+        <w:ind w:left="2880" w:hanging="360"/>
+      </w:pPr>
+      <w:rPr>
+        <w:rFonts w:ascii="Wingdings" w:hAnsi="Wingdings" w:hint="default"/>
+        <w:sz w:val="20"/>
+      </w:rPr>
+    </w:lvl>
+    <w:lvl w:ilvl="4" w:tentative="1">
+      <w:start w:val="1"/>
+      <w:numFmt w:val="bullet"/>
+      <w:lvlText w:val=""/>
+      <w:lvlJc w:val="left"/>
+      <w:pPr>
+        <w:tabs>
+          <w:tab w:val="num" w:pos="3600"/>
+        </w:tabs>
+        <w:ind w:left="3600" w:hanging="360"/>
+      </w:pPr>
+      <w:rPr>
+        <w:rFonts w:ascii="Wingdings" w:hAnsi="Wingdings" w:hint="default"/>
+        <w:sz w:val="20"/>
+      </w:rPr>
+    </w:lvl>
+    <w:lvl w:ilvl="5" w:tentative="1">
+      <w:start w:val="1"/>
+      <w:numFmt w:val="bullet"/>
+      <w:lvlText w:val=""/>
+      <w:lvlJc w:val="left"/>
+      <w:pPr>
+        <w:tabs>
+          <w:tab w:val="num" w:pos="4320"/>
+        </w:tabs>
+        <w:ind w:left="4320" w:hanging="360"/>
+      </w:pPr>
+      <w:rPr>
+        <w:rFonts w:ascii="Wingdings" w:hAnsi="Wingdings" w:hint="default"/>
+        <w:sz w:val="20"/>
+      </w:rPr>
+    </w:lvl>
+    <w:lvl w:ilvl="6" w:tentative="1">
+      <w:start w:val="1"/>
+      <w:numFmt w:val="bullet"/>
+      <w:lvlText w:val=""/>
+      <w:lvlJc w:val="left"/>
+      <w:pPr>
+        <w:tabs>
+          <w:tab w:val="num" w:pos="5040"/>
+        </w:tabs>
+        <w:ind w:left="5040" w:hanging="360"/>
+      </w:pPr>
+      <w:rPr>
+        <w:rFonts w:ascii="Wingdings" w:hAnsi="Wingdings" w:hint="default"/>
+        <w:sz w:val="20"/>
+      </w:rPr>
+    </w:lvl>
+    <w:lvl w:ilvl="7" w:tentative="1">
+      <w:start w:val="1"/>
+      <w:numFmt w:val="bullet"/>
+      <w:lvlText w:val=""/>
+      <w:lvlJc w:val="left"/>
+      <w:pPr>
+        <w:tabs>
+          <w:tab w:val="num" w:pos="5760"/>
+        </w:tabs>
+        <w:ind w:left="5760" w:hanging="360"/>
+      </w:pPr>
+      <w:rPr>
+        <w:rFonts w:ascii="Wingdings" w:hAnsi="Wingdings" w:hint="default"/>
+        <w:sz w:val="20"/>
+      </w:rPr>
+    </w:lvl>
+    <w:lvl w:ilvl="8" w:tentative="1">
+      <w:start w:val="1"/>
+      <w:numFmt w:val="bullet"/>
+      <w:lvlText w:val=""/>
+      <w:lvlJc w:val="left"/>
+      <w:pPr>
+        <w:tabs>
+          <w:tab w:val="num" w:pos="6480"/>
+        </w:tabs>
+        <w:ind w:left="6480" w:hanging="360"/>
+      </w:pPr>
+      <w:rPr>
+        <w:rFonts w:ascii="Wingdings" w:hAnsi="Wingdings" w:hint="default"/>
+        <w:sz w:val="20"/>
+      </w:rPr>
+    </w:lvl>
+  </w:abstractNum>
+  <w:abstractNum w:abstractNumId="4" w15:restartNumberingAfterBreak="0">
     <w:nsid w:val="17CE7AD9"/>
     <w:multiLevelType w:val="hybridMultilevel"/>
     <w:tmpl w:val="64E29C08"/>
@@ -7496,7 +10395,7 @@
       </w:rPr>
     </w:lvl>
   </w:abstractNum>
-  <w:abstractNum w:abstractNumId="2" w15:restartNumberingAfterBreak="0">
+  <w:abstractNum w:abstractNumId="5" w15:restartNumberingAfterBreak="0">
     <w:nsid w:val="18011250"/>
     <w:multiLevelType w:val="hybridMultilevel"/>
     <w:tmpl w:val="4BE63AEE"/>
@@ -7609,7 +10508,156 @@
       </w:rPr>
     </w:lvl>
   </w:abstractNum>
-  <w:abstractNum w:abstractNumId="3" w15:restartNumberingAfterBreak="0">
+  <w:abstractNum w:abstractNumId="6" w15:restartNumberingAfterBreak="0">
+    <w:nsid w:val="1BE606D0"/>
+    <w:multiLevelType w:val="multilevel"/>
+    <w:tmpl w:val="F2D694E6"/>
+    <w:lvl w:ilvl="0">
+      <w:start w:val="1"/>
+      <w:numFmt w:val="bullet"/>
+      <w:lvlText w:val=""/>
+      <w:lvlJc w:val="left"/>
+      <w:pPr>
+        <w:tabs>
+          <w:tab w:val="num" w:pos="720"/>
+        </w:tabs>
+        <w:ind w:left="720" w:hanging="360"/>
+      </w:pPr>
+      <w:rPr>
+        <w:rFonts w:ascii="Symbol" w:hAnsi="Symbol" w:hint="default"/>
+        <w:sz w:val="20"/>
+      </w:rPr>
+    </w:lvl>
+    <w:lvl w:ilvl="1" w:tentative="1">
+      <w:start w:val="1"/>
+      <w:numFmt w:val="bullet"/>
+      <w:lvlText w:val="o"/>
+      <w:lvlJc w:val="left"/>
+      <w:pPr>
+        <w:tabs>
+          <w:tab w:val="num" w:pos="1440"/>
+        </w:tabs>
+        <w:ind w:left="1440" w:hanging="360"/>
+      </w:pPr>
+      <w:rPr>
+        <w:rFonts w:ascii="Courier New" w:hAnsi="Courier New" w:hint="default"/>
+        <w:sz w:val="20"/>
+      </w:rPr>
+    </w:lvl>
+    <w:lvl w:ilvl="2" w:tentative="1">
+      <w:start w:val="1"/>
+      <w:numFmt w:val="bullet"/>
+      <w:lvlText w:val=""/>
+      <w:lvlJc w:val="left"/>
+      <w:pPr>
+        <w:tabs>
+          <w:tab w:val="num" w:pos="2160"/>
+        </w:tabs>
+        <w:ind w:left="2160" w:hanging="360"/>
+      </w:pPr>
+      <w:rPr>
+        <w:rFonts w:ascii="Wingdings" w:hAnsi="Wingdings" w:hint="default"/>
+        <w:sz w:val="20"/>
+      </w:rPr>
+    </w:lvl>
+    <w:lvl w:ilvl="3" w:tentative="1">
+      <w:start w:val="1"/>
+      <w:numFmt w:val="bullet"/>
+      <w:lvlText w:val=""/>
+      <w:lvlJc w:val="left"/>
+      <w:pPr>
+        <w:tabs>
+          <w:tab w:val="num" w:pos="2880"/>
+        </w:tabs>
+        <w:ind w:left="2880" w:hanging="360"/>
+      </w:pPr>
+      <w:rPr>
+        <w:rFonts w:ascii="Wingdings" w:hAnsi="Wingdings" w:hint="default"/>
+        <w:sz w:val="20"/>
+      </w:rPr>
+    </w:lvl>
+    <w:lvl w:ilvl="4" w:tentative="1">
+      <w:start w:val="1"/>
+      <w:numFmt w:val="bullet"/>
+      <w:lvlText w:val=""/>
+      <w:lvlJc w:val="left"/>
+      <w:pPr>
+        <w:tabs>
+          <w:tab w:val="num" w:pos="3600"/>
+        </w:tabs>
+        <w:ind w:left="3600" w:hanging="360"/>
+      </w:pPr>
+      <w:rPr>
+        <w:rFonts w:ascii="Wingdings" w:hAnsi="Wingdings" w:hint="default"/>
+        <w:sz w:val="20"/>
+      </w:rPr>
+    </w:lvl>
+    <w:lvl w:ilvl="5" w:tentative="1">
+      <w:start w:val="1"/>
+      <w:numFmt w:val="bullet"/>
+      <w:lvlText w:val=""/>
+      <w:lvlJc w:val="left"/>
+      <w:pPr>
+        <w:tabs>
+          <w:tab w:val="num" w:pos="4320"/>
+        </w:tabs>
+        <w:ind w:left="4320" w:hanging="360"/>
+      </w:pPr>
+      <w:rPr>
+        <w:rFonts w:ascii="Wingdings" w:hAnsi="Wingdings" w:hint="default"/>
+        <w:sz w:val="20"/>
+      </w:rPr>
+    </w:lvl>
+    <w:lvl w:ilvl="6" w:tentative="1">
+      <w:start w:val="1"/>
+      <w:numFmt w:val="bullet"/>
+      <w:lvlText w:val=""/>
+      <w:lvlJc w:val="left"/>
+      <w:pPr>
+        <w:tabs>
+          <w:tab w:val="num" w:pos="5040"/>
+        </w:tabs>
+        <w:ind w:left="5040" w:hanging="360"/>
+      </w:pPr>
+      <w:rPr>
+        <w:rFonts w:ascii="Wingdings" w:hAnsi="Wingdings" w:hint="default"/>
+        <w:sz w:val="20"/>
+      </w:rPr>
+    </w:lvl>
+    <w:lvl w:ilvl="7" w:tentative="1">
+      <w:start w:val="1"/>
+      <w:numFmt w:val="bullet"/>
+      <w:lvlText w:val=""/>
+      <w:lvlJc w:val="left"/>
+      <w:pPr>
+        <w:tabs>
+          <w:tab w:val="num" w:pos="5760"/>
+        </w:tabs>
+        <w:ind w:left="5760" w:hanging="360"/>
+      </w:pPr>
+      <w:rPr>
+        <w:rFonts w:ascii="Wingdings" w:hAnsi="Wingdings" w:hint="default"/>
+        <w:sz w:val="20"/>
+      </w:rPr>
+    </w:lvl>
+    <w:lvl w:ilvl="8" w:tentative="1">
+      <w:start w:val="1"/>
+      <w:numFmt w:val="bullet"/>
+      <w:lvlText w:val=""/>
+      <w:lvlJc w:val="left"/>
+      <w:pPr>
+        <w:tabs>
+          <w:tab w:val="num" w:pos="6480"/>
+        </w:tabs>
+        <w:ind w:left="6480" w:hanging="360"/>
+      </w:pPr>
+      <w:rPr>
+        <w:rFonts w:ascii="Wingdings" w:hAnsi="Wingdings" w:hint="default"/>
+        <w:sz w:val="20"/>
+      </w:rPr>
+    </w:lvl>
+  </w:abstractNum>
+  <w:abstractNum w:abstractNumId="7" w15:restartNumberingAfterBreak="0">
     <w:nsid w:val="28BD21F2"/>
     <w:multiLevelType w:val="hybridMultilevel"/>
     <w:tmpl w:val="E6AC0FC2"/>
@@ -7698,7 +10746,305 @@
       </w:pPr>
     </w:lvl>
   </w:abstractNum>
-  <w:abstractNum w:abstractNumId="4" w15:restartNumberingAfterBreak="0">
+  <w:abstractNum w:abstractNumId="8" w15:restartNumberingAfterBreak="0">
+    <w:nsid w:val="29C51B4D"/>
+    <w:multiLevelType w:val="multilevel"/>
+    <w:tmpl w:val="F8F22086"/>
+    <w:lvl w:ilvl="0">
+      <w:start w:val="1"/>
+      <w:numFmt w:val="bullet"/>
+      <w:lvlText w:val=""/>
+      <w:lvlJc w:val="left"/>
+      <w:pPr>
+        <w:tabs>
+          <w:tab w:val="num" w:pos="720"/>
+        </w:tabs>
+        <w:ind w:left="720" w:hanging="360"/>
+      </w:pPr>
+      <w:rPr>
+        <w:rFonts w:ascii="Symbol" w:hAnsi="Symbol" w:hint="default"/>
+        <w:sz w:val="20"/>
+      </w:rPr>
+    </w:lvl>
+    <w:lvl w:ilvl="1" w:tentative="1">
+      <w:start w:val="1"/>
+      <w:numFmt w:val="bullet"/>
+      <w:lvlText w:val="o"/>
+      <w:lvlJc w:val="left"/>
+      <w:pPr>
+        <w:tabs>
+          <w:tab w:val="num" w:pos="1440"/>
+        </w:tabs>
+        <w:ind w:left="1440" w:hanging="360"/>
+      </w:pPr>
+      <w:rPr>
+        <w:rFonts w:ascii="Courier New" w:hAnsi="Courier New" w:hint="default"/>
+        <w:sz w:val="20"/>
+      </w:rPr>
+    </w:lvl>
+    <w:lvl w:ilvl="2" w:tentative="1">
+      <w:start w:val="1"/>
+      <w:numFmt w:val="bullet"/>
+      <w:lvlText w:val=""/>
+      <w:lvlJc w:val="left"/>
+      <w:pPr>
+        <w:tabs>
+          <w:tab w:val="num" w:pos="2160"/>
+        </w:tabs>
+        <w:ind w:left="2160" w:hanging="360"/>
+      </w:pPr>
+      <w:rPr>
+        <w:rFonts w:ascii="Wingdings" w:hAnsi="Wingdings" w:hint="default"/>
+        <w:sz w:val="20"/>
+      </w:rPr>
+    </w:lvl>
+    <w:lvl w:ilvl="3" w:tentative="1">
+      <w:start w:val="1"/>
+      <w:numFmt w:val="bullet"/>
+      <w:lvlText w:val=""/>
+      <w:lvlJc w:val="left"/>
+      <w:pPr>
+        <w:tabs>
+          <w:tab w:val="num" w:pos="2880"/>
+        </w:tabs>
+        <w:ind w:left="2880" w:hanging="360"/>
+      </w:pPr>
+      <w:rPr>
+        <w:rFonts w:ascii="Wingdings" w:hAnsi="Wingdings" w:hint="default"/>
+        <w:sz w:val="20"/>
+      </w:rPr>
+    </w:lvl>
+    <w:lvl w:ilvl="4" w:tentative="1">
+      <w:start w:val="1"/>
+      <w:numFmt w:val="bullet"/>
+      <w:lvlText w:val=""/>
+      <w:lvlJc w:val="left"/>
+      <w:pPr>
+        <w:tabs>
+          <w:tab w:val="num" w:pos="3600"/>
+        </w:tabs>
+        <w:ind w:left="3600" w:hanging="360"/>
+      </w:pPr>
+      <w:rPr>
+        <w:rFonts w:ascii="Wingdings" w:hAnsi="Wingdings" w:hint="default"/>
+        <w:sz w:val="20"/>
+      </w:rPr>
+    </w:lvl>
+    <w:lvl w:ilvl="5" w:tentative="1">
+      <w:start w:val="1"/>
+      <w:numFmt w:val="bullet"/>
+      <w:lvlText w:val=""/>
+      <w:lvlJc w:val="left"/>
+      <w:pPr>
+        <w:tabs>
+          <w:tab w:val="num" w:pos="4320"/>
+        </w:tabs>
+        <w:ind w:left="4320" w:hanging="360"/>
+      </w:pPr>
+      <w:rPr>
+        <w:rFonts w:ascii="Wingdings" w:hAnsi="Wingdings" w:hint="default"/>
+        <w:sz w:val="20"/>
+      </w:rPr>
+    </w:lvl>
+    <w:lvl w:ilvl="6" w:tentative="1">
+      <w:start w:val="1"/>
+      <w:numFmt w:val="bullet"/>
+      <w:lvlText w:val=""/>
+      <w:lvlJc w:val="left"/>
+      <w:pPr>
+        <w:tabs>
+          <w:tab w:val="num" w:pos="5040"/>
+        </w:tabs>
+        <w:ind w:left="5040" w:hanging="360"/>
+      </w:pPr>
+      <w:rPr>
+        <w:rFonts w:ascii="Wingdings" w:hAnsi="Wingdings" w:hint="default"/>
+        <w:sz w:val="20"/>
+      </w:rPr>
+    </w:lvl>
+    <w:lvl w:ilvl="7" w:tentative="1">
+      <w:start w:val="1"/>
+      <w:numFmt w:val="bullet"/>
+      <w:lvlText w:val=""/>
+      <w:lvlJc w:val="left"/>
+      <w:pPr>
+        <w:tabs>
+          <w:tab w:val="num" w:pos="5760"/>
+        </w:tabs>
+        <w:ind w:left="5760" w:hanging="360"/>
+      </w:pPr>
+      <w:rPr>
+        <w:rFonts w:ascii="Wingdings" w:hAnsi="Wingdings" w:hint="default"/>
+        <w:sz w:val="20"/>
+      </w:rPr>
+    </w:lvl>
+    <w:lvl w:ilvl="8" w:tentative="1">
+      <w:start w:val="1"/>
+      <w:numFmt w:val="bullet"/>
+      <w:lvlText w:val=""/>
+      <w:lvlJc w:val="left"/>
+      <w:pPr>
+        <w:tabs>
+          <w:tab w:val="num" w:pos="6480"/>
+        </w:tabs>
+        <w:ind w:left="6480" w:hanging="360"/>
+      </w:pPr>
+      <w:rPr>
+        <w:rFonts w:ascii="Wingdings" w:hAnsi="Wingdings" w:hint="default"/>
+        <w:sz w:val="20"/>
+      </w:rPr>
+    </w:lvl>
+  </w:abstractNum>
+  <w:abstractNum w:abstractNumId="9" w15:restartNumberingAfterBreak="0">
+    <w:nsid w:val="3FCA6492"/>
+    <w:multiLevelType w:val="multilevel"/>
+    <w:tmpl w:val="DFEC04F8"/>
+    <w:lvl w:ilvl="0">
+      <w:start w:val="1"/>
+      <w:numFmt w:val="bullet"/>
+      <w:lvlText w:val=""/>
+      <w:lvlJc w:val="left"/>
+      <w:pPr>
+        <w:tabs>
+          <w:tab w:val="num" w:pos="720"/>
+        </w:tabs>
+        <w:ind w:left="720" w:hanging="360"/>
+      </w:pPr>
+      <w:rPr>
+        <w:rFonts w:ascii="Symbol" w:hAnsi="Symbol" w:hint="default"/>
+        <w:sz w:val="20"/>
+      </w:rPr>
+    </w:lvl>
+    <w:lvl w:ilvl="1" w:tentative="1">
+      <w:start w:val="1"/>
+      <w:numFmt w:val="bullet"/>
+      <w:lvlText w:val="o"/>
+      <w:lvlJc w:val="left"/>
+      <w:pPr>
+        <w:tabs>
+          <w:tab w:val="num" w:pos="1440"/>
+        </w:tabs>
+        <w:ind w:left="1440" w:hanging="360"/>
+      </w:pPr>
+      <w:rPr>
+        <w:rFonts w:ascii="Courier New" w:hAnsi="Courier New" w:hint="default"/>
+        <w:sz w:val="20"/>
+      </w:rPr>
+    </w:lvl>
+    <w:lvl w:ilvl="2" w:tentative="1">
+      <w:start w:val="1"/>
+      <w:numFmt w:val="bullet"/>
+      <w:lvlText w:val=""/>
+      <w:lvlJc w:val="left"/>
+      <w:pPr>
+        <w:tabs>
+          <w:tab w:val="num" w:pos="2160"/>
+        </w:tabs>
+        <w:ind w:left="2160" w:hanging="360"/>
+      </w:pPr>
+      <w:rPr>
+        <w:rFonts w:ascii="Wingdings" w:hAnsi="Wingdings" w:hint="default"/>
+        <w:sz w:val="20"/>
+      </w:rPr>
+    </w:lvl>
+    <w:lvl w:ilvl="3" w:tentative="1">
+      <w:start w:val="1"/>
+      <w:numFmt w:val="bullet"/>
+      <w:lvlText w:val=""/>
+      <w:lvlJc w:val="left"/>
+      <w:pPr>
+        <w:tabs>
+          <w:tab w:val="num" w:pos="2880"/>
+        </w:tabs>
+        <w:ind w:left="2880" w:hanging="360"/>
+      </w:pPr>
+      <w:rPr>
+        <w:rFonts w:ascii="Wingdings" w:hAnsi="Wingdings" w:hint="default"/>
+        <w:sz w:val="20"/>
+      </w:rPr>
+    </w:lvl>
+    <w:lvl w:ilvl="4" w:tentative="1">
+      <w:start w:val="1"/>
+      <w:numFmt w:val="bullet"/>
+      <w:lvlText w:val=""/>
+      <w:lvlJc w:val="left"/>
+      <w:pPr>
+        <w:tabs>
+          <w:tab w:val="num" w:pos="3600"/>
+        </w:tabs>
+        <w:ind w:left="3600" w:hanging="360"/>
+      </w:pPr>
+      <w:rPr>
+        <w:rFonts w:ascii="Wingdings" w:hAnsi="Wingdings" w:hint="default"/>
+        <w:sz w:val="20"/>
+      </w:rPr>
+    </w:lvl>
+    <w:lvl w:ilvl="5" w:tentative="1">
+      <w:start w:val="1"/>
+      <w:numFmt w:val="bullet"/>
+      <w:lvlText w:val=""/>
+      <w:lvlJc w:val="left"/>
+      <w:pPr>
+        <w:tabs>
+          <w:tab w:val="num" w:pos="4320"/>
+        </w:tabs>
+        <w:ind w:left="4320" w:hanging="360"/>
+      </w:pPr>
+      <w:rPr>
+        <w:rFonts w:ascii="Wingdings" w:hAnsi="Wingdings" w:hint="default"/>
+        <w:sz w:val="20"/>
+      </w:rPr>
+    </w:lvl>
+    <w:lvl w:ilvl="6" w:tentative="1">
+      <w:start w:val="1"/>
+      <w:numFmt w:val="bullet"/>
+      <w:lvlText w:val=""/>
+      <w:lvlJc w:val="left"/>
+      <w:pPr>
+        <w:tabs>
+          <w:tab w:val="num" w:pos="5040"/>
+        </w:tabs>
+        <w:ind w:left="5040" w:hanging="360"/>
+      </w:pPr>
+      <w:rPr>
+        <w:rFonts w:ascii="Wingdings" w:hAnsi="Wingdings" w:hint="default"/>
+        <w:sz w:val="20"/>
+      </w:rPr>
+    </w:lvl>
+    <w:lvl w:ilvl="7" w:tentative="1">
+      <w:start w:val="1"/>
+      <w:numFmt w:val="bullet"/>
+      <w:lvlText w:val=""/>
+      <w:lvlJc w:val="left"/>
+      <w:pPr>
+        <w:tabs>
+          <w:tab w:val="num" w:pos="5760"/>
+        </w:tabs>
+        <w:ind w:left="5760" w:hanging="360"/>
+      </w:pPr>
+      <w:rPr>
+        <w:rFonts w:ascii="Wingdings" w:hAnsi="Wingdings" w:hint="default"/>
+        <w:sz w:val="20"/>
+      </w:rPr>
+    </w:lvl>
+    <w:lvl w:ilvl="8" w:tentative="1">
+      <w:start w:val="1"/>
+      <w:numFmt w:val="bullet"/>
+      <w:lvlText w:val=""/>
+      <w:lvlJc w:val="left"/>
+      <w:pPr>
+        <w:tabs>
+          <w:tab w:val="num" w:pos="6480"/>
+        </w:tabs>
+        <w:ind w:left="6480" w:hanging="360"/>
+      </w:pPr>
+      <w:rPr>
+        <w:rFonts w:ascii="Wingdings" w:hAnsi="Wingdings" w:hint="default"/>
+        <w:sz w:val="20"/>
+      </w:rPr>
+    </w:lvl>
+  </w:abstractNum>
+  <w:abstractNum w:abstractNumId="10" w15:restartNumberingAfterBreak="0">
     <w:nsid w:val="420E4E6C"/>
     <w:multiLevelType w:val="hybridMultilevel"/>
     <w:tmpl w:val="B8F04F3A"/>
@@ -7811,7 +11157,7 @@
       </w:rPr>
     </w:lvl>
   </w:abstractNum>
-  <w:abstractNum w:abstractNumId="5" w15:restartNumberingAfterBreak="0">
+  <w:abstractNum w:abstractNumId="11" w15:restartNumberingAfterBreak="0">
     <w:nsid w:val="544A5A39"/>
     <w:multiLevelType w:val="hybridMultilevel"/>
     <w:tmpl w:val="359E4824"/>
@@ -7924,7 +11270,156 @@
       </w:rPr>
     </w:lvl>
   </w:abstractNum>
-  <w:abstractNum w:abstractNumId="6" w15:restartNumberingAfterBreak="0">
+  <w:abstractNum w:abstractNumId="12" w15:restartNumberingAfterBreak="0">
+    <w:nsid w:val="549F26E8"/>
+    <w:multiLevelType w:val="multilevel"/>
+    <w:tmpl w:val="8CFE6DB8"/>
+    <w:lvl w:ilvl="0">
+      <w:start w:val="1"/>
+      <w:numFmt w:val="bullet"/>
+      <w:lvlText w:val=""/>
+      <w:lvlJc w:val="left"/>
+      <w:pPr>
+        <w:tabs>
+          <w:tab w:val="num" w:pos="720"/>
+        </w:tabs>
+        <w:ind w:left="720" w:hanging="360"/>
+      </w:pPr>
+      <w:rPr>
+        <w:rFonts w:ascii="Symbol" w:hAnsi="Symbol" w:hint="default"/>
+        <w:sz w:val="20"/>
+      </w:rPr>
+    </w:lvl>
+    <w:lvl w:ilvl="1" w:tentative="1">
+      <w:start w:val="1"/>
+      <w:numFmt w:val="bullet"/>
+      <w:lvlText w:val="o"/>
+      <w:lvlJc w:val="left"/>
+      <w:pPr>
+        <w:tabs>
+          <w:tab w:val="num" w:pos="1440"/>
+        </w:tabs>
+        <w:ind w:left="1440" w:hanging="360"/>
+      </w:pPr>
+      <w:rPr>
+        <w:rFonts w:ascii="Courier New" w:hAnsi="Courier New" w:hint="default"/>
+        <w:sz w:val="20"/>
+      </w:rPr>
+    </w:lvl>
+    <w:lvl w:ilvl="2" w:tentative="1">
+      <w:start w:val="1"/>
+      <w:numFmt w:val="bullet"/>
+      <w:lvlText w:val=""/>
+      <w:lvlJc w:val="left"/>
+      <w:pPr>
+        <w:tabs>
+          <w:tab w:val="num" w:pos="2160"/>
+        </w:tabs>
+        <w:ind w:left="2160" w:hanging="360"/>
+      </w:pPr>
+      <w:rPr>
+        <w:rFonts w:ascii="Wingdings" w:hAnsi="Wingdings" w:hint="default"/>
+        <w:sz w:val="20"/>
+      </w:rPr>
+    </w:lvl>
+    <w:lvl w:ilvl="3" w:tentative="1">
+      <w:start w:val="1"/>
+      <w:numFmt w:val="bullet"/>
+      <w:lvlText w:val=""/>
+      <w:lvlJc w:val="left"/>
+      <w:pPr>
+        <w:tabs>
+          <w:tab w:val="num" w:pos="2880"/>
+        </w:tabs>
+        <w:ind w:left="2880" w:hanging="360"/>
+      </w:pPr>
+      <w:rPr>
+        <w:rFonts w:ascii="Wingdings" w:hAnsi="Wingdings" w:hint="default"/>
+        <w:sz w:val="20"/>
+      </w:rPr>
+    </w:lvl>
+    <w:lvl w:ilvl="4" w:tentative="1">
+      <w:start w:val="1"/>
+      <w:numFmt w:val="bullet"/>
+      <w:lvlText w:val=""/>
+      <w:lvlJc w:val="left"/>
+      <w:pPr>
+        <w:tabs>
+          <w:tab w:val="num" w:pos="3600"/>
+        </w:tabs>
+        <w:ind w:left="3600" w:hanging="360"/>
+      </w:pPr>
+      <w:rPr>
+        <w:rFonts w:ascii="Wingdings" w:hAnsi="Wingdings" w:hint="default"/>
+        <w:sz w:val="20"/>
+      </w:rPr>
+    </w:lvl>
+    <w:lvl w:ilvl="5" w:tentative="1">
+      <w:start w:val="1"/>
+      <w:numFmt w:val="bullet"/>
+      <w:lvlText w:val=""/>
+      <w:lvlJc w:val="left"/>
+      <w:pPr>
+        <w:tabs>
+          <w:tab w:val="num" w:pos="4320"/>
+        </w:tabs>
+        <w:ind w:left="4320" w:hanging="360"/>
+      </w:pPr>
+      <w:rPr>
+        <w:rFonts w:ascii="Wingdings" w:hAnsi="Wingdings" w:hint="default"/>
+        <w:sz w:val="20"/>
+      </w:rPr>
+    </w:lvl>
+    <w:lvl w:ilvl="6" w:tentative="1">
+      <w:start w:val="1"/>
+      <w:numFmt w:val="bullet"/>
+      <w:lvlText w:val=""/>
+      <w:lvlJc w:val="left"/>
+      <w:pPr>
+        <w:tabs>
+          <w:tab w:val="num" w:pos="5040"/>
+        </w:tabs>
+        <w:ind w:left="5040" w:hanging="360"/>
+      </w:pPr>
+      <w:rPr>
+        <w:rFonts w:ascii="Wingdings" w:hAnsi="Wingdings" w:hint="default"/>
+        <w:sz w:val="20"/>
+      </w:rPr>
+    </w:lvl>
+    <w:lvl w:ilvl="7" w:tentative="1">
+      <w:start w:val="1"/>
+      <w:numFmt w:val="bullet"/>
+      <w:lvlText w:val=""/>
+      <w:lvlJc w:val="left"/>
+      <w:pPr>
+        <w:tabs>
+          <w:tab w:val="num" w:pos="5760"/>
+        </w:tabs>
+        <w:ind w:left="5760" w:hanging="360"/>
+      </w:pPr>
+      <w:rPr>
+        <w:rFonts w:ascii="Wingdings" w:hAnsi="Wingdings" w:hint="default"/>
+        <w:sz w:val="20"/>
+      </w:rPr>
+    </w:lvl>
+    <w:lvl w:ilvl="8" w:tentative="1">
+      <w:start w:val="1"/>
+      <w:numFmt w:val="bullet"/>
+      <w:lvlText w:val=""/>
+      <w:lvlJc w:val="left"/>
+      <w:pPr>
+        <w:tabs>
+          <w:tab w:val="num" w:pos="6480"/>
+        </w:tabs>
+        <w:ind w:left="6480" w:hanging="360"/>
+      </w:pPr>
+      <w:rPr>
+        <w:rFonts w:ascii="Wingdings" w:hAnsi="Wingdings" w:hint="default"/>
+        <w:sz w:val="20"/>
+      </w:rPr>
+    </w:lvl>
+  </w:abstractNum>
+  <w:abstractNum w:abstractNumId="13" w15:restartNumberingAfterBreak="0">
     <w:nsid w:val="5F226516"/>
     <w:multiLevelType w:val="hybridMultilevel"/>
     <w:tmpl w:val="8BC47872"/>
@@ -8010,7 +11505,156 @@
       </w:pPr>
     </w:lvl>
   </w:abstractNum>
-  <w:abstractNum w:abstractNumId="7" w15:restartNumberingAfterBreak="0">
+  <w:abstractNum w:abstractNumId="14" w15:restartNumberingAfterBreak="0">
+    <w:nsid w:val="5F8C45C7"/>
+    <w:multiLevelType w:val="multilevel"/>
+    <w:tmpl w:val="64243C28"/>
+    <w:lvl w:ilvl="0">
+      <w:start w:val="1"/>
+      <w:numFmt w:val="bullet"/>
+      <w:lvlText w:val=""/>
+      <w:lvlJc w:val="left"/>
+      <w:pPr>
+        <w:tabs>
+          <w:tab w:val="num" w:pos="720"/>
+        </w:tabs>
+        <w:ind w:left="720" w:hanging="360"/>
+      </w:pPr>
+      <w:rPr>
+        <w:rFonts w:ascii="Symbol" w:hAnsi="Symbol" w:hint="default"/>
+        <w:sz w:val="20"/>
+      </w:rPr>
+    </w:lvl>
+    <w:lvl w:ilvl="1" w:tentative="1">
+      <w:start w:val="1"/>
+      <w:numFmt w:val="bullet"/>
+      <w:lvlText w:val="o"/>
+      <w:lvlJc w:val="left"/>
+      <w:pPr>
+        <w:tabs>
+          <w:tab w:val="num" w:pos="1440"/>
+        </w:tabs>
+        <w:ind w:left="1440" w:hanging="360"/>
+      </w:pPr>
+      <w:rPr>
+        <w:rFonts w:ascii="Courier New" w:hAnsi="Courier New" w:hint="default"/>
+        <w:sz w:val="20"/>
+      </w:rPr>
+    </w:lvl>
+    <w:lvl w:ilvl="2" w:tentative="1">
+      <w:start w:val="1"/>
+      <w:numFmt w:val="bullet"/>
+      <w:lvlText w:val=""/>
+      <w:lvlJc w:val="left"/>
+      <w:pPr>
+        <w:tabs>
+          <w:tab w:val="num" w:pos="2160"/>
+        </w:tabs>
+        <w:ind w:left="2160" w:hanging="360"/>
+      </w:pPr>
+      <w:rPr>
+        <w:rFonts w:ascii="Wingdings" w:hAnsi="Wingdings" w:hint="default"/>
+        <w:sz w:val="20"/>
+      </w:rPr>
+    </w:lvl>
+    <w:lvl w:ilvl="3" w:tentative="1">
+      <w:start w:val="1"/>
+      <w:numFmt w:val="bullet"/>
+      <w:lvlText w:val=""/>
+      <w:lvlJc w:val="left"/>
+      <w:pPr>
+        <w:tabs>
+          <w:tab w:val="num" w:pos="2880"/>
+        </w:tabs>
+        <w:ind w:left="2880" w:hanging="360"/>
+      </w:pPr>
+      <w:rPr>
+        <w:rFonts w:ascii="Wingdings" w:hAnsi="Wingdings" w:hint="default"/>
+        <w:sz w:val="20"/>
+      </w:rPr>
+    </w:lvl>
+    <w:lvl w:ilvl="4" w:tentative="1">
+      <w:start w:val="1"/>
+      <w:numFmt w:val="bullet"/>
+      <w:lvlText w:val=""/>
+      <w:lvlJc w:val="left"/>
+      <w:pPr>
+        <w:tabs>
+          <w:tab w:val="num" w:pos="3600"/>
+        </w:tabs>
+        <w:ind w:left="3600" w:hanging="360"/>
+      </w:pPr>
+      <w:rPr>
+        <w:rFonts w:ascii="Wingdings" w:hAnsi="Wingdings" w:hint="default"/>
+        <w:sz w:val="20"/>
+      </w:rPr>
+    </w:lvl>
+    <w:lvl w:ilvl="5" w:tentative="1">
+      <w:start w:val="1"/>
+      <w:numFmt w:val="bullet"/>
+      <w:lvlText w:val=""/>
+      <w:lvlJc w:val="left"/>
+      <w:pPr>
+        <w:tabs>
+          <w:tab w:val="num" w:pos="4320"/>
+        </w:tabs>
+        <w:ind w:left="4320" w:hanging="360"/>
+      </w:pPr>
+      <w:rPr>
+        <w:rFonts w:ascii="Wingdings" w:hAnsi="Wingdings" w:hint="default"/>
+        <w:sz w:val="20"/>
+      </w:rPr>
+    </w:lvl>
+    <w:lvl w:ilvl="6" w:tentative="1">
+      <w:start w:val="1"/>
+      <w:numFmt w:val="bullet"/>
+      <w:lvlText w:val=""/>
+      <w:lvlJc w:val="left"/>
+      <w:pPr>
+        <w:tabs>
+          <w:tab w:val="num" w:pos="5040"/>
+        </w:tabs>
+        <w:ind w:left="5040" w:hanging="360"/>
+      </w:pPr>
+      <w:rPr>
+        <w:rFonts w:ascii="Wingdings" w:hAnsi="Wingdings" w:hint="default"/>
+        <w:sz w:val="20"/>
+      </w:rPr>
+    </w:lvl>
+    <w:lvl w:ilvl="7" w:tentative="1">
+      <w:start w:val="1"/>
+      <w:numFmt w:val="bullet"/>
+      <w:lvlText w:val=""/>
+      <w:lvlJc w:val="left"/>
+      <w:pPr>
+        <w:tabs>
+          <w:tab w:val="num" w:pos="5760"/>
+        </w:tabs>
+        <w:ind w:left="5760" w:hanging="360"/>
+      </w:pPr>
+      <w:rPr>
+        <w:rFonts w:ascii="Wingdings" w:hAnsi="Wingdings" w:hint="default"/>
+        <w:sz w:val="20"/>
+      </w:rPr>
+    </w:lvl>
+    <w:lvl w:ilvl="8" w:tentative="1">
+      <w:start w:val="1"/>
+      <w:numFmt w:val="bullet"/>
+      <w:lvlText w:val=""/>
+      <w:lvlJc w:val="left"/>
+      <w:pPr>
+        <w:tabs>
+          <w:tab w:val="num" w:pos="6480"/>
+        </w:tabs>
+        <w:ind w:left="6480" w:hanging="360"/>
+      </w:pPr>
+      <w:rPr>
+        <w:rFonts w:ascii="Wingdings" w:hAnsi="Wingdings" w:hint="default"/>
+        <w:sz w:val="20"/>
+      </w:rPr>
+    </w:lvl>
+  </w:abstractNum>
+  <w:abstractNum w:abstractNumId="15" w15:restartNumberingAfterBreak="0">
     <w:nsid w:val="667437F4"/>
     <w:multiLevelType w:val="hybridMultilevel"/>
     <w:tmpl w:val="48FEB2B2"/>
@@ -8123,7 +11767,156 @@
       </w:rPr>
     </w:lvl>
   </w:abstractNum>
-  <w:abstractNum w:abstractNumId="8" w15:restartNumberingAfterBreak="0">
+  <w:abstractNum w:abstractNumId="16" w15:restartNumberingAfterBreak="0">
+    <w:nsid w:val="6CFC53B5"/>
+    <w:multiLevelType w:val="multilevel"/>
+    <w:tmpl w:val="328EDCB4"/>
+    <w:lvl w:ilvl="0">
+      <w:start w:val="1"/>
+      <w:numFmt w:val="bullet"/>
+      <w:lvlText w:val=""/>
+      <w:lvlJc w:val="left"/>
+      <w:pPr>
+        <w:tabs>
+          <w:tab w:val="num" w:pos="720"/>
+        </w:tabs>
+        <w:ind w:left="720" w:hanging="360"/>
+      </w:pPr>
+      <w:rPr>
+        <w:rFonts w:ascii="Symbol" w:hAnsi="Symbol" w:hint="default"/>
+        <w:sz w:val="20"/>
+      </w:rPr>
+    </w:lvl>
+    <w:lvl w:ilvl="1" w:tentative="1">
+      <w:start w:val="1"/>
+      <w:numFmt w:val="bullet"/>
+      <w:lvlText w:val="o"/>
+      <w:lvlJc w:val="left"/>
+      <w:pPr>
+        <w:tabs>
+          <w:tab w:val="num" w:pos="1440"/>
+        </w:tabs>
+        <w:ind w:left="1440" w:hanging="360"/>
+      </w:pPr>
+      <w:rPr>
+        <w:rFonts w:ascii="Courier New" w:hAnsi="Courier New" w:hint="default"/>
+        <w:sz w:val="20"/>
+      </w:rPr>
+    </w:lvl>
+    <w:lvl w:ilvl="2" w:tentative="1">
+      <w:start w:val="1"/>
+      <w:numFmt w:val="bullet"/>
+      <w:lvlText w:val=""/>
+      <w:lvlJc w:val="left"/>
+      <w:pPr>
+        <w:tabs>
+          <w:tab w:val="num" w:pos="2160"/>
+        </w:tabs>
+        <w:ind w:left="2160" w:hanging="360"/>
+      </w:pPr>
+      <w:rPr>
+        <w:rFonts w:ascii="Wingdings" w:hAnsi="Wingdings" w:hint="default"/>
+        <w:sz w:val="20"/>
+      </w:rPr>
+    </w:lvl>
+    <w:lvl w:ilvl="3" w:tentative="1">
+      <w:start w:val="1"/>
+      <w:numFmt w:val="bullet"/>
+      <w:lvlText w:val=""/>
+      <w:lvlJc w:val="left"/>
+      <w:pPr>
+        <w:tabs>
+          <w:tab w:val="num" w:pos="2880"/>
+        </w:tabs>
+        <w:ind w:left="2880" w:hanging="360"/>
+      </w:pPr>
+      <w:rPr>
+        <w:rFonts w:ascii="Wingdings" w:hAnsi="Wingdings" w:hint="default"/>
+        <w:sz w:val="20"/>
+      </w:rPr>
+    </w:lvl>
+    <w:lvl w:ilvl="4" w:tentative="1">
+      <w:start w:val="1"/>
+      <w:numFmt w:val="bullet"/>
+      <w:lvlText w:val=""/>
+      <w:lvlJc w:val="left"/>
+      <w:pPr>
+        <w:tabs>
+          <w:tab w:val="num" w:pos="3600"/>
+        </w:tabs>
+        <w:ind w:left="3600" w:hanging="360"/>
+      </w:pPr>
+      <w:rPr>
+        <w:rFonts w:ascii="Wingdings" w:hAnsi="Wingdings" w:hint="default"/>
+        <w:sz w:val="20"/>
+      </w:rPr>
+    </w:lvl>
+    <w:lvl w:ilvl="5" w:tentative="1">
+      <w:start w:val="1"/>
+      <w:numFmt w:val="bullet"/>
+      <w:lvlText w:val=""/>
+      <w:lvlJc w:val="left"/>
+      <w:pPr>
+        <w:tabs>
+          <w:tab w:val="num" w:pos="4320"/>
+        </w:tabs>
+        <w:ind w:left="4320" w:hanging="360"/>
+      </w:pPr>
+      <w:rPr>
+        <w:rFonts w:ascii="Wingdings" w:hAnsi="Wingdings" w:hint="default"/>
+        <w:sz w:val="20"/>
+      </w:rPr>
+    </w:lvl>
+    <w:lvl w:ilvl="6" w:tentative="1">
+      <w:start w:val="1"/>
+      <w:numFmt w:val="bullet"/>
+      <w:lvlText w:val=""/>
+      <w:lvlJc w:val="left"/>
+      <w:pPr>
+        <w:tabs>
+          <w:tab w:val="num" w:pos="5040"/>
+        </w:tabs>
+        <w:ind w:left="5040" w:hanging="360"/>
+      </w:pPr>
+      <w:rPr>
+        <w:rFonts w:ascii="Wingdings" w:hAnsi="Wingdings" w:hint="default"/>
+        <w:sz w:val="20"/>
+      </w:rPr>
+    </w:lvl>
+    <w:lvl w:ilvl="7" w:tentative="1">
+      <w:start w:val="1"/>
+      <w:numFmt w:val="bullet"/>
+      <w:lvlText w:val=""/>
+      <w:lvlJc w:val="left"/>
+      <w:pPr>
+        <w:tabs>
+          <w:tab w:val="num" w:pos="5760"/>
+        </w:tabs>
+        <w:ind w:left="5760" w:hanging="360"/>
+      </w:pPr>
+      <w:rPr>
+        <w:rFonts w:ascii="Wingdings" w:hAnsi="Wingdings" w:hint="default"/>
+        <w:sz w:val="20"/>
+      </w:rPr>
+    </w:lvl>
+    <w:lvl w:ilvl="8" w:tentative="1">
+      <w:start w:val="1"/>
+      <w:numFmt w:val="bullet"/>
+      <w:lvlText w:val=""/>
+      <w:lvlJc w:val="left"/>
+      <w:pPr>
+        <w:tabs>
+          <w:tab w:val="num" w:pos="6480"/>
+        </w:tabs>
+        <w:ind w:left="6480" w:hanging="360"/>
+      </w:pPr>
+      <w:rPr>
+        <w:rFonts w:ascii="Wingdings" w:hAnsi="Wingdings" w:hint="default"/>
+        <w:sz w:val="20"/>
+      </w:rPr>
+    </w:lvl>
+  </w:abstractNum>
+  <w:abstractNum w:abstractNumId="17" w15:restartNumberingAfterBreak="0">
     <w:nsid w:val="71952EA4"/>
     <w:multiLevelType w:val="hybridMultilevel"/>
     <w:tmpl w:val="B0A66902"/>
@@ -8236,7 +12029,7 @@
       </w:rPr>
     </w:lvl>
   </w:abstractNum>
-  <w:abstractNum w:abstractNumId="9" w15:restartNumberingAfterBreak="0">
+  <w:abstractNum w:abstractNumId="18" w15:restartNumberingAfterBreak="0">
     <w:nsid w:val="74150F2C"/>
     <w:multiLevelType w:val="hybridMultilevel"/>
     <w:tmpl w:val="F1DE6F4C"/>
@@ -8350,34 +12143,61 @@
     </w:lvl>
   </w:abstractNum>
   <w:num w:numId="1" w16cid:durableId="1388190532">
+    <w:abstractNumId w:val="4"/>
+  </w:num>
+  <w:num w:numId="2" w16cid:durableId="649291419">
+    <w:abstractNumId w:val="11"/>
+  </w:num>
+  <w:num w:numId="3" w16cid:durableId="150680516">
+    <w:abstractNumId w:val="17"/>
+  </w:num>
+  <w:num w:numId="4" w16cid:durableId="534731923">
     <w:abstractNumId w:val="1"/>
   </w:num>
-  <w:num w:numId="2" w16cid:durableId="649291419">
+  <w:num w:numId="5" w16cid:durableId="1052463348">
+    <w:abstractNumId w:val="15"/>
+  </w:num>
+  <w:num w:numId="6" w16cid:durableId="1499225423">
     <w:abstractNumId w:val="5"/>
   </w:num>
-  <w:num w:numId="3" w16cid:durableId="150680516">
+  <w:num w:numId="7" w16cid:durableId="1913003730">
+    <w:abstractNumId w:val="10"/>
+  </w:num>
+  <w:num w:numId="8" w16cid:durableId="263462878">
+    <w:abstractNumId w:val="18"/>
+  </w:num>
+  <w:num w:numId="9" w16cid:durableId="2078937094">
+    <w:abstractNumId w:val="13"/>
+  </w:num>
+  <w:num w:numId="10" w16cid:durableId="45956522">
+    <w:abstractNumId w:val="7"/>
+  </w:num>
+  <w:num w:numId="11" w16cid:durableId="913204991">
+    <w:abstractNumId w:val="16"/>
+  </w:num>
+  <w:num w:numId="12" w16cid:durableId="115293304">
+    <w:abstractNumId w:val="3"/>
+  </w:num>
+  <w:num w:numId="13" w16cid:durableId="1259291761">
+    <w:abstractNumId w:val="2"/>
+  </w:num>
+  <w:num w:numId="14" w16cid:durableId="1179468825">
+    <w:abstractNumId w:val="12"/>
+  </w:num>
+  <w:num w:numId="15" w16cid:durableId="355619880">
     <w:abstractNumId w:val="8"/>
   </w:num>
-  <w:num w:numId="4" w16cid:durableId="534731923">
-    <w:abstractNumId w:val="0"/>
-  </w:num>
-  <w:num w:numId="5" w16cid:durableId="1052463348">
-    <w:abstractNumId w:val="7"/>
-  </w:num>
-  <w:num w:numId="6" w16cid:durableId="1499225423">
-    <w:abstractNumId w:val="2"/>
-  </w:num>
-  <w:num w:numId="7" w16cid:durableId="1913003730">
-    <w:abstractNumId w:val="4"/>
-  </w:num>
-  <w:num w:numId="8" w16cid:durableId="263462878">
+  <w:num w:numId="16" w16cid:durableId="108475784">
     <w:abstractNumId w:val="9"/>
   </w:num>
-  <w:num w:numId="9" w16cid:durableId="2078937094">
+  <w:num w:numId="17" w16cid:durableId="247428632">
+    <w:abstractNumId w:val="14"/>
+  </w:num>
+  <w:num w:numId="18" w16cid:durableId="1619608406">
     <w:abstractNumId w:val="6"/>
   </w:num>
-  <w:num w:numId="10" w16cid:durableId="45956522">
-    <w:abstractNumId w:val="3"/>
+  <w:num w:numId="19" w16cid:durableId="1367875258">
+    <w:abstractNumId w:val="0"/>
   </w:num>
 </w:numbering>
 </file>
@@ -8789,7 +12609,6 @@
   <w:style w:type="character" w:default="1" w:styleId="DefaultParagraphFont">
     <w:name w:val="Default Paragraph Font"/>
     <w:uiPriority w:val="1"/>
-    <w:semiHidden/>
     <w:unhideWhenUsed/>
   </w:style>
   <w:style w:type="table" w:default="1" w:styleId="TableNormal">

</xml_diff>